<commit_message>
Actualización links de videos y Actividad Didáctica
</commit_message>
<xml_diff>
--- a/fuentes/CF2_AD.docx
+++ b/fuentes/CF2_AD.docx
@@ -12,7 +12,6 @@
     </w:p>
     <w:tbl>
       <w:tblPr>
-        <w:tblStyle w:val="a"/>
         <w:tblW w:w="10005" w:type="dxa"/>
         <w:tblInd w:w="-680" w:type="dxa"/>
         <w:tblBorders>
@@ -27,9 +26,9 @@
         <w:tblLook w:val="04A0" w:firstRow="1" w:lastRow="0" w:firstColumn="1" w:lastColumn="0" w:noHBand="0" w:noVBand="1"/>
       </w:tblPr>
       <w:tblGrid>
-        <w:gridCol w:w="1125"/>
-        <w:gridCol w:w="1410"/>
-        <w:gridCol w:w="105"/>
+        <w:gridCol w:w="1083"/>
+        <w:gridCol w:w="1345"/>
+        <w:gridCol w:w="212"/>
         <w:gridCol w:w="4155"/>
         <w:gridCol w:w="1035"/>
         <w:gridCol w:w="2175"/>
@@ -701,7 +700,7 @@
         <w:tc>
           <w:tcPr>
             <w:cnfStyle w:val="001000000000" w:firstRow="0" w:lastRow="0" w:firstColumn="1" w:lastColumn="0" w:oddVBand="0" w:evenVBand="0" w:oddHBand="0" w:evenHBand="0" w:firstRowFirstColumn="0" w:firstRowLastColumn="0" w:lastRowFirstColumn="0" w:lastRowLastColumn="0"/>
-            <w:tcW w:w="1125" w:type="dxa"/>
+            <w:tcW w:w="1083" w:type="dxa"/>
             <w:tcMar/>
           </w:tcPr>
           <w:p>
@@ -724,7 +723,7 @@
         <w:tc>
           <w:tcPr>
             <w:cnfStyle w:val="000000000000" w:firstRow="0" w:lastRow="0" w:firstColumn="0" w:lastColumn="0" w:oddVBand="0" w:evenVBand="0" w:oddHBand="0" w:evenHBand="0" w:firstRowFirstColumn="0" w:firstRowLastColumn="0" w:lastRowFirstColumn="0" w:lastRowLastColumn="0"/>
-            <w:tcW w:w="5670" w:type="dxa"/>
+            <w:tcW w:w="5712" w:type="dxa"/>
             <w:gridSpan w:val="3"/>
             <w:tcMar/>
           </w:tcPr>
@@ -827,7 +826,7 @@
         <w:tc>
           <w:tcPr>
             <w:cnfStyle w:val="001000000000" w:firstRow="0" w:lastRow="0" w:firstColumn="1" w:lastColumn="0" w:oddVBand="0" w:evenVBand="0" w:oddHBand="0" w:evenHBand="0" w:firstRowFirstColumn="0" w:firstRowLastColumn="0" w:lastRowFirstColumn="0" w:lastRowLastColumn="0"/>
-            <w:tcW w:w="1125" w:type="dxa"/>
+            <w:tcW w:w="1083" w:type="dxa"/>
             <w:tcMar/>
           </w:tcPr>
           <w:p>
@@ -850,7 +849,7 @@
         <w:tc>
           <w:tcPr>
             <w:cnfStyle w:val="000000000000" w:firstRow="0" w:lastRow="0" w:firstColumn="0" w:lastColumn="0" w:oddVBand="0" w:evenVBand="0" w:oddHBand="0" w:evenHBand="0" w:firstRowFirstColumn="0" w:firstRowLastColumn="0" w:lastRowFirstColumn="0" w:lastRowLastColumn="0"/>
-            <w:tcW w:w="5670" w:type="dxa"/>
+            <w:tcW w:w="5712" w:type="dxa"/>
             <w:gridSpan w:val="3"/>
             <w:shd w:val="clear" w:color="auto" w:fill="FFFFFF" w:themeFill="background1"/>
             <w:tcMar/>
@@ -920,7 +919,7 @@
         <w:tc>
           <w:tcPr>
             <w:cnfStyle w:val="001000000000" w:firstRow="0" w:lastRow="0" w:firstColumn="1" w:lastColumn="0" w:oddVBand="0" w:evenVBand="0" w:oddHBand="0" w:evenHBand="0" w:firstRowFirstColumn="0" w:firstRowLastColumn="0" w:lastRowFirstColumn="0" w:lastRowLastColumn="0"/>
-            <w:tcW w:w="1125" w:type="dxa"/>
+            <w:tcW w:w="1083" w:type="dxa"/>
             <w:tcMar/>
           </w:tcPr>
           <w:p>
@@ -943,7 +942,7 @@
         <w:tc>
           <w:tcPr>
             <w:cnfStyle w:val="000000000000" w:firstRow="0" w:lastRow="0" w:firstColumn="0" w:lastColumn="0" w:oddVBand="0" w:evenVBand="0" w:oddHBand="0" w:evenHBand="0" w:firstRowFirstColumn="0" w:firstRowLastColumn="0" w:lastRowFirstColumn="0" w:lastRowLastColumn="0"/>
-            <w:tcW w:w="5670" w:type="dxa"/>
+            <w:tcW w:w="5712" w:type="dxa"/>
             <w:gridSpan w:val="3"/>
             <w:shd w:val="clear" w:color="auto" w:fill="FFFFFF" w:themeFill="background1"/>
             <w:tcMar/>
@@ -1014,7 +1013,7 @@
         <w:tc>
           <w:tcPr>
             <w:cnfStyle w:val="001000000000" w:firstRow="0" w:lastRow="0" w:firstColumn="1" w:lastColumn="0" w:oddVBand="0" w:evenVBand="0" w:oddHBand="0" w:evenHBand="0" w:firstRowFirstColumn="0" w:firstRowLastColumn="0" w:lastRowFirstColumn="0" w:lastRowLastColumn="0"/>
-            <w:tcW w:w="1125" w:type="dxa"/>
+            <w:tcW w:w="1083" w:type="dxa"/>
             <w:tcMar/>
           </w:tcPr>
           <w:p>
@@ -1037,7 +1036,7 @@
         <w:tc>
           <w:tcPr>
             <w:cnfStyle w:val="000000000000" w:firstRow="0" w:lastRow="0" w:firstColumn="0" w:lastColumn="0" w:oddVBand="0" w:evenVBand="0" w:oddHBand="0" w:evenHBand="0" w:firstRowFirstColumn="0" w:firstRowLastColumn="0" w:lastRowFirstColumn="0" w:lastRowLastColumn="0"/>
-            <w:tcW w:w="5670" w:type="dxa"/>
+            <w:tcW w:w="5712" w:type="dxa"/>
             <w:gridSpan w:val="3"/>
             <w:shd w:val="clear" w:color="auto" w:fill="FFFFFF" w:themeFill="background1"/>
             <w:tcMar/>
@@ -1123,7 +1122,7 @@
         <w:tc>
           <w:tcPr>
             <w:cnfStyle w:val="001000000000" w:firstRow="0" w:lastRow="0" w:firstColumn="1" w:lastColumn="0" w:oddVBand="0" w:evenVBand="0" w:oddHBand="0" w:evenHBand="0" w:firstRowFirstColumn="0" w:firstRowLastColumn="0" w:lastRowFirstColumn="0" w:lastRowLastColumn="0"/>
-            <w:tcW w:w="1125" w:type="dxa"/>
+            <w:tcW w:w="1083" w:type="dxa"/>
             <w:tcMar/>
           </w:tcPr>
           <w:p>
@@ -1146,7 +1145,7 @@
         <w:tc>
           <w:tcPr>
             <w:cnfStyle w:val="000000000000" w:firstRow="0" w:lastRow="0" w:firstColumn="0" w:lastColumn="0" w:oddVBand="0" w:evenVBand="0" w:oddHBand="0" w:evenHBand="0" w:firstRowFirstColumn="0" w:firstRowLastColumn="0" w:lastRowFirstColumn="0" w:lastRowLastColumn="0"/>
-            <w:tcW w:w="5670" w:type="dxa"/>
+            <w:tcW w:w="5712" w:type="dxa"/>
             <w:gridSpan w:val="3"/>
             <w:shd w:val="clear" w:color="auto" w:fill="FFFFFF" w:themeFill="background1"/>
             <w:tcMar/>
@@ -1247,7 +1246,7 @@
         <w:tc>
           <w:tcPr>
             <w:cnfStyle w:val="001000000000" w:firstRow="0" w:lastRow="0" w:firstColumn="1" w:lastColumn="0" w:oddVBand="0" w:evenVBand="0" w:oddHBand="0" w:evenHBand="0" w:firstRowFirstColumn="0" w:firstRowLastColumn="0" w:lastRowFirstColumn="0" w:lastRowLastColumn="0"/>
-            <w:tcW w:w="2535" w:type="dxa"/>
+            <w:tcW w:w="2428" w:type="dxa"/>
             <w:gridSpan w:val="2"/>
             <w:tcMar/>
           </w:tcPr>
@@ -1278,7 +1277,7 @@
         <w:tc>
           <w:tcPr>
             <w:cnfStyle w:val="000000000000" w:firstRow="0" w:lastRow="0" w:firstColumn="0" w:lastColumn="0" w:oddVBand="0" w:evenVBand="0" w:oddHBand="0" w:evenHBand="0" w:firstRowFirstColumn="0" w:firstRowLastColumn="0" w:lastRowFirstColumn="0" w:lastRowLastColumn="0"/>
-            <w:tcW w:w="7470" w:type="dxa"/>
+            <w:tcW w:w="7577" w:type="dxa"/>
             <w:gridSpan w:val="4"/>
             <w:shd w:val="clear" w:color="auto" w:fill="FFFFFF" w:themeFill="background1"/>
             <w:tcMar/>
@@ -1294,14 +1293,28 @@
             <w:r>
               <w:rPr>
                 <w:rFonts w:ascii="Calibri" w:hAnsi="Calibri" w:eastAsia="Calibri" w:cs="Calibri"/>
-                <w:color w:val="000000"/>
-              </w:rPr>
-              <w:t xml:space="preserve">¡Excelente! Te felicito, has </w:t>
-            </w:r>
-            <w:r>
-              <w:rPr>
-                <w:rFonts w:ascii="Calibri" w:hAnsi="Calibri" w:eastAsia="Calibri" w:cs="Calibri"/>
-                <w:color w:val="000000"/>
+                <w:color w:val="000000" w:themeColor="text1" w:themeTint="FF" w:themeShade="FF"/>
+              </w:rPr>
+              <w:t>¡Excelente</w:t>
+            </w:r>
+            <w:r>
+              <w:rPr>
+                <w:rFonts w:ascii="Calibri" w:hAnsi="Calibri" w:eastAsia="Calibri" w:cs="Calibri"/>
+                <w:color w:val="000000" w:themeColor="text1" w:themeTint="FF" w:themeShade="FF"/>
+              </w:rPr>
+              <w:t xml:space="preserve"> felicidades!</w:t>
+            </w:r>
+            <w:r>
+              <w:rPr>
+                <w:rFonts w:ascii="Calibri" w:hAnsi="Calibri" w:eastAsia="Calibri" w:cs="Calibri"/>
+                <w:color w:val="000000" w:themeColor="text1" w:themeTint="FF" w:themeShade="FF"/>
+              </w:rPr>
+              <w:t xml:space="preserve">, ha </w:t>
+            </w:r>
+            <w:r>
+              <w:rPr>
+                <w:rFonts w:ascii="Calibri" w:hAnsi="Calibri" w:eastAsia="Calibri" w:cs="Calibri"/>
+                <w:color w:val="000000" w:themeColor="text1" w:themeTint="FF" w:themeShade="FF"/>
               </w:rPr>
               <w:t>seleccionado la respuesta correcta</w:t>
             </w:r>
@@ -1326,7 +1339,7 @@
         <w:tc>
           <w:tcPr>
             <w:cnfStyle w:val="001000000000" w:firstRow="0" w:lastRow="0" w:firstColumn="1" w:lastColumn="0" w:oddVBand="0" w:evenVBand="0" w:oddHBand="0" w:evenHBand="0" w:firstRowFirstColumn="0" w:firstRowLastColumn="0" w:lastRowFirstColumn="0" w:lastRowLastColumn="0"/>
-            <w:tcW w:w="2535" w:type="dxa"/>
+            <w:tcW w:w="2428" w:type="dxa"/>
             <w:gridSpan w:val="2"/>
             <w:tcMar/>
           </w:tcPr>
@@ -1358,26 +1371,33 @@
         <w:tc>
           <w:tcPr>
             <w:cnfStyle w:val="000000000000" w:firstRow="0" w:lastRow="0" w:firstColumn="0" w:lastColumn="0" w:oddVBand="0" w:evenVBand="0" w:oddHBand="0" w:evenHBand="0" w:firstRowFirstColumn="0" w:firstRowLastColumn="0" w:lastRowFirstColumn="0" w:lastRowLastColumn="0"/>
-            <w:tcW w:w="7470" w:type="dxa"/>
+            <w:tcW w:w="7577" w:type="dxa"/>
             <w:gridSpan w:val="4"/>
             <w:shd w:val="clear" w:color="auto" w:fill="FFFFFF" w:themeFill="background1"/>
             <w:tcMar/>
           </w:tcPr>
           <w:p>
             <w:pPr>
-              <w:cnfStyle w:val="000000100000" w:firstRow="0" w:lastRow="0" w:firstColumn="0" w:lastColumn="0" w:oddVBand="0" w:evenVBand="0" w:oddHBand="1" w:evenHBand="0" w:firstRowFirstColumn="0" w:firstRowLastColumn="0" w:lastRowFirstColumn="0" w:lastRowLastColumn="0"/>
-              <w:rPr>
-                <w:rFonts w:ascii="Calibri" w:hAnsi="Calibri" w:eastAsia="Calibri" w:cs="Calibri"/>
-                <w:color w:val="000000"/>
-              </w:rPr>
-            </w:pPr>
-            <w:r>
-              <w:rPr>
-                <w:rFonts w:ascii="Calibri" w:hAnsi="Calibri" w:eastAsia="Calibri" w:cs="Calibri"/>
-                <w:color w:val="000000"/>
-              </w:rPr>
-              <w:t>Te recomendamos volver a revisar el componente formativo e intentar nuevamente la actividad didáctica</w:t>
-            </w:r>
+              <w:rPr>
+                <w:rFonts w:ascii="Calibri" w:hAnsi="Calibri" w:eastAsia="Calibri" w:cs="Calibri"/>
+                <w:color w:val="000000" w:themeColor="text1" w:themeTint="FF" w:themeShade="FF"/>
+              </w:rPr>
+            </w:pPr>
+            <w:r>
+              <w:rPr>
+                <w:rFonts w:ascii="Calibri" w:hAnsi="Calibri" w:eastAsia="Calibri" w:cs="Calibri"/>
+                <w:color w:val="000000" w:themeColor="text1" w:themeTint="FF" w:themeShade="FF"/>
+              </w:rPr>
+              <w:t>Se recomienda volver a revisar el componente formativo e intentar nuevamente la actividad didáctica</w:t>
+            </w:r>
+          </w:p>
+          <w:p>
+            <w:pPr>
+              <w:rPr>
+                <w:rFonts w:ascii="Calibri" w:hAnsi="Calibri" w:eastAsia="Calibri" w:cs="Calibri"/>
+                <w:color w:val="000000" w:themeColor="text1" w:themeTint="FF" w:themeShade="FF"/>
+              </w:rPr>
+            </w:pPr>
           </w:p>
           <w:p>
             <w:pPr>
@@ -1496,7 +1516,7 @@
         <w:tc>
           <w:tcPr>
             <w:cnfStyle w:val="001000000000" w:firstRow="0" w:lastRow="0" w:firstColumn="1" w:lastColumn="0" w:oddVBand="0" w:evenVBand="0" w:oddHBand="0" w:evenHBand="0" w:firstRowFirstColumn="0" w:firstRowLastColumn="0" w:lastRowFirstColumn="0" w:lastRowLastColumn="0"/>
-            <w:tcW w:w="1125" w:type="dxa"/>
+            <w:tcW w:w="1083" w:type="dxa"/>
             <w:tcMar/>
           </w:tcPr>
           <w:p>
@@ -1519,7 +1539,7 @@
         <w:tc>
           <w:tcPr>
             <w:cnfStyle w:val="000000000000" w:firstRow="0" w:lastRow="0" w:firstColumn="0" w:lastColumn="0" w:oddVBand="0" w:evenVBand="0" w:oddHBand="0" w:evenHBand="0" w:firstRowFirstColumn="0" w:firstRowLastColumn="0" w:lastRowFirstColumn="0" w:lastRowLastColumn="0"/>
-            <w:tcW w:w="5670" w:type="dxa"/>
+            <w:tcW w:w="5712" w:type="dxa"/>
             <w:gridSpan w:val="3"/>
             <w:tcMar/>
           </w:tcPr>
@@ -1622,7 +1642,7 @@
         <w:tc>
           <w:tcPr>
             <w:cnfStyle w:val="001000000000" w:firstRow="0" w:lastRow="0" w:firstColumn="1" w:lastColumn="0" w:oddVBand="0" w:evenVBand="0" w:oddHBand="0" w:evenHBand="0" w:firstRowFirstColumn="0" w:firstRowLastColumn="0" w:lastRowFirstColumn="0" w:lastRowLastColumn="0"/>
-            <w:tcW w:w="1125" w:type="dxa"/>
+            <w:tcW w:w="1083" w:type="dxa"/>
             <w:tcMar/>
           </w:tcPr>
           <w:p>
@@ -1645,7 +1665,7 @@
         <w:tc>
           <w:tcPr>
             <w:cnfStyle w:val="000000000000" w:firstRow="0" w:lastRow="0" w:firstColumn="0" w:lastColumn="0" w:oddVBand="0" w:evenVBand="0" w:oddHBand="0" w:evenHBand="0" w:firstRowFirstColumn="0" w:firstRowLastColumn="0" w:lastRowFirstColumn="0" w:lastRowLastColumn="0"/>
-            <w:tcW w:w="5670" w:type="dxa"/>
+            <w:tcW w:w="5712" w:type="dxa"/>
             <w:gridSpan w:val="3"/>
             <w:shd w:val="clear" w:color="auto" w:fill="FFFFFF" w:themeFill="background1"/>
             <w:tcMar/>
@@ -1715,7 +1735,7 @@
         <w:tc>
           <w:tcPr>
             <w:cnfStyle w:val="001000000000" w:firstRow="0" w:lastRow="0" w:firstColumn="1" w:lastColumn="0" w:oddVBand="0" w:evenVBand="0" w:oddHBand="0" w:evenHBand="0" w:firstRowFirstColumn="0" w:firstRowLastColumn="0" w:lastRowFirstColumn="0" w:lastRowLastColumn="0"/>
-            <w:tcW w:w="1125" w:type="dxa"/>
+            <w:tcW w:w="1083" w:type="dxa"/>
             <w:tcMar/>
           </w:tcPr>
           <w:p>
@@ -1738,7 +1758,7 @@
         <w:tc>
           <w:tcPr>
             <w:cnfStyle w:val="000000000000" w:firstRow="0" w:lastRow="0" w:firstColumn="0" w:lastColumn="0" w:oddVBand="0" w:evenVBand="0" w:oddHBand="0" w:evenHBand="0" w:firstRowFirstColumn="0" w:firstRowLastColumn="0" w:lastRowFirstColumn="0" w:lastRowLastColumn="0"/>
-            <w:tcW w:w="5670" w:type="dxa"/>
+            <w:tcW w:w="5712" w:type="dxa"/>
             <w:gridSpan w:val="3"/>
             <w:shd w:val="clear" w:color="auto" w:fill="FFFFFF" w:themeFill="background1"/>
             <w:tcMar/>
@@ -1809,7 +1829,7 @@
         <w:tc>
           <w:tcPr>
             <w:cnfStyle w:val="001000000000" w:firstRow="0" w:lastRow="0" w:firstColumn="1" w:lastColumn="0" w:oddVBand="0" w:evenVBand="0" w:oddHBand="0" w:evenHBand="0" w:firstRowFirstColumn="0" w:firstRowLastColumn="0" w:lastRowFirstColumn="0" w:lastRowLastColumn="0"/>
-            <w:tcW w:w="1125" w:type="dxa"/>
+            <w:tcW w:w="1083" w:type="dxa"/>
             <w:tcMar/>
           </w:tcPr>
           <w:p>
@@ -1832,7 +1852,7 @@
         <w:tc>
           <w:tcPr>
             <w:cnfStyle w:val="000000000000" w:firstRow="0" w:lastRow="0" w:firstColumn="0" w:lastColumn="0" w:oddVBand="0" w:evenVBand="0" w:oddHBand="0" w:evenHBand="0" w:firstRowFirstColumn="0" w:firstRowLastColumn="0" w:lastRowFirstColumn="0" w:lastRowLastColumn="0"/>
-            <w:tcW w:w="5670" w:type="dxa"/>
+            <w:tcW w:w="5712" w:type="dxa"/>
             <w:gridSpan w:val="3"/>
             <w:shd w:val="clear" w:color="auto" w:fill="FFFFFF" w:themeFill="background1"/>
             <w:tcMar/>
@@ -1918,7 +1938,7 @@
         <w:tc>
           <w:tcPr>
             <w:cnfStyle w:val="001000000000" w:firstRow="0" w:lastRow="0" w:firstColumn="1" w:lastColumn="0" w:oddVBand="0" w:evenVBand="0" w:oddHBand="0" w:evenHBand="0" w:firstRowFirstColumn="0" w:firstRowLastColumn="0" w:lastRowFirstColumn="0" w:lastRowLastColumn="0"/>
-            <w:tcW w:w="1125" w:type="dxa"/>
+            <w:tcW w:w="1083" w:type="dxa"/>
             <w:tcMar/>
           </w:tcPr>
           <w:p>
@@ -1941,7 +1961,7 @@
         <w:tc>
           <w:tcPr>
             <w:cnfStyle w:val="000000000000" w:firstRow="0" w:lastRow="0" w:firstColumn="0" w:lastColumn="0" w:oddVBand="0" w:evenVBand="0" w:oddHBand="0" w:evenHBand="0" w:firstRowFirstColumn="0" w:firstRowLastColumn="0" w:lastRowFirstColumn="0" w:lastRowLastColumn="0"/>
-            <w:tcW w:w="5670" w:type="dxa"/>
+            <w:tcW w:w="5712" w:type="dxa"/>
             <w:gridSpan w:val="3"/>
             <w:shd w:val="clear" w:color="auto" w:fill="FFFFFF" w:themeFill="background1"/>
             <w:tcMar/>
@@ -2042,7 +2062,7 @@
         <w:tc>
           <w:tcPr>
             <w:cnfStyle w:val="001000000000" w:firstRow="0" w:lastRow="0" w:firstColumn="1" w:lastColumn="0" w:oddVBand="0" w:evenVBand="0" w:oddHBand="0" w:evenHBand="0" w:firstRowFirstColumn="0" w:firstRowLastColumn="0" w:lastRowFirstColumn="0" w:lastRowLastColumn="0"/>
-            <w:tcW w:w="2535" w:type="dxa"/>
+            <w:tcW w:w="2428" w:type="dxa"/>
             <w:gridSpan w:val="2"/>
             <w:tcMar/>
           </w:tcPr>
@@ -2066,26 +2086,33 @@
         <w:tc>
           <w:tcPr>
             <w:cnfStyle w:val="000000000000" w:firstRow="0" w:lastRow="0" w:firstColumn="0" w:lastColumn="0" w:oddVBand="0" w:evenVBand="0" w:oddHBand="0" w:evenHBand="0" w:firstRowFirstColumn="0" w:firstRowLastColumn="0" w:lastRowFirstColumn="0" w:lastRowLastColumn="0"/>
-            <w:tcW w:w="7470" w:type="dxa"/>
+            <w:tcW w:w="7577" w:type="dxa"/>
             <w:gridSpan w:val="4"/>
             <w:shd w:val="clear" w:color="auto" w:fill="FFFFFF" w:themeFill="background1"/>
             <w:tcMar/>
           </w:tcPr>
           <w:p>
             <w:pPr>
-              <w:cnfStyle w:val="000000000000" w:firstRow="0" w:lastRow="0" w:firstColumn="0" w:lastColumn="0" w:oddVBand="0" w:evenVBand="0" w:oddHBand="0" w:evenHBand="0" w:firstRowFirstColumn="0" w:firstRowLastColumn="0" w:lastRowFirstColumn="0" w:lastRowLastColumn="0"/>
-              <w:rPr>
-                <w:rFonts w:ascii="Calibri" w:hAnsi="Calibri" w:eastAsia="Calibri" w:cs="Calibri"/>
-                <w:color w:val="000000"/>
-              </w:rPr>
-            </w:pPr>
-            <w:r>
-              <w:rPr>
-                <w:rFonts w:ascii="Calibri" w:hAnsi="Calibri" w:eastAsia="Calibri" w:cs="Calibri"/>
-                <w:color w:val="000000"/>
-              </w:rPr>
-              <w:t>¡Excelente! Te felicito, has seleccionado la respuesta correcta</w:t>
-            </w:r>
+              <w:rPr>
+                <w:rFonts w:ascii="Calibri" w:hAnsi="Calibri" w:eastAsia="Calibri" w:cs="Calibri"/>
+                <w:color w:val="000000" w:themeColor="text1" w:themeTint="FF" w:themeShade="FF"/>
+              </w:rPr>
+            </w:pPr>
+            <w:r>
+              <w:rPr>
+                <w:rFonts w:ascii="Calibri" w:hAnsi="Calibri" w:eastAsia="Calibri" w:cs="Calibri"/>
+                <w:color w:val="000000" w:themeColor="text1" w:themeTint="FF" w:themeShade="FF"/>
+              </w:rPr>
+              <w:t>¡Excelente felicidades!, ha seleccionado la respuesta correcta</w:t>
+            </w:r>
+          </w:p>
+          <w:p>
+            <w:pPr>
+              <w:rPr>
+                <w:rFonts w:ascii="Calibri" w:hAnsi="Calibri" w:eastAsia="Calibri" w:cs="Calibri"/>
+                <w:color w:val="000000" w:themeColor="text1" w:themeTint="FF" w:themeShade="FF"/>
+              </w:rPr>
+            </w:pPr>
           </w:p>
           <w:p>
             <w:pPr>
@@ -2107,7 +2134,7 @@
         <w:tc>
           <w:tcPr>
             <w:cnfStyle w:val="001000000000" w:firstRow="0" w:lastRow="0" w:firstColumn="1" w:lastColumn="0" w:oddVBand="0" w:evenVBand="0" w:oddHBand="0" w:evenHBand="0" w:firstRowFirstColumn="0" w:firstRowLastColumn="0" w:lastRowFirstColumn="0" w:lastRowLastColumn="0"/>
-            <w:tcW w:w="2535" w:type="dxa"/>
+            <w:tcW w:w="2428" w:type="dxa"/>
             <w:gridSpan w:val="2"/>
             <w:tcMar/>
           </w:tcPr>
@@ -2139,26 +2166,33 @@
         <w:tc>
           <w:tcPr>
             <w:cnfStyle w:val="000000000000" w:firstRow="0" w:lastRow="0" w:firstColumn="0" w:lastColumn="0" w:oddVBand="0" w:evenVBand="0" w:oddHBand="0" w:evenHBand="0" w:firstRowFirstColumn="0" w:firstRowLastColumn="0" w:lastRowFirstColumn="0" w:lastRowLastColumn="0"/>
-            <w:tcW w:w="7470" w:type="dxa"/>
+            <w:tcW w:w="7577" w:type="dxa"/>
             <w:gridSpan w:val="4"/>
             <w:shd w:val="clear" w:color="auto" w:fill="FFFFFF" w:themeFill="background1"/>
             <w:tcMar/>
           </w:tcPr>
           <w:p>
             <w:pPr>
-              <w:cnfStyle w:val="000000100000" w:firstRow="0" w:lastRow="0" w:firstColumn="0" w:lastColumn="0" w:oddVBand="0" w:evenVBand="0" w:oddHBand="1" w:evenHBand="0" w:firstRowFirstColumn="0" w:firstRowLastColumn="0" w:lastRowFirstColumn="0" w:lastRowLastColumn="0"/>
-              <w:rPr>
-                <w:rFonts w:ascii="Calibri" w:hAnsi="Calibri" w:eastAsia="Calibri" w:cs="Calibri"/>
-                <w:color w:val="000000"/>
-              </w:rPr>
-            </w:pPr>
-            <w:r>
-              <w:rPr>
-                <w:rFonts w:ascii="Calibri" w:hAnsi="Calibri" w:eastAsia="Calibri" w:cs="Calibri"/>
-                <w:color w:val="000000"/>
-              </w:rPr>
-              <w:t>Te recomendamos volver a revisar el componente formativo e intentar nuevamente la actividad didáctica</w:t>
-            </w:r>
+              <w:rPr>
+                <w:rFonts w:ascii="Calibri" w:hAnsi="Calibri" w:eastAsia="Calibri" w:cs="Calibri"/>
+                <w:color w:val="000000" w:themeColor="text1" w:themeTint="FF" w:themeShade="FF"/>
+              </w:rPr>
+            </w:pPr>
+            <w:r>
+              <w:rPr>
+                <w:rFonts w:ascii="Calibri" w:hAnsi="Calibri" w:eastAsia="Calibri" w:cs="Calibri"/>
+                <w:color w:val="000000" w:themeColor="text1" w:themeTint="FF" w:themeShade="FF"/>
+              </w:rPr>
+              <w:t>Se recomienda volver a revisar el componente formativo e intentar nuevamente la actividad didáctica</w:t>
+            </w:r>
+          </w:p>
+          <w:p>
+            <w:pPr>
+              <w:rPr>
+                <w:rFonts w:ascii="Calibri" w:hAnsi="Calibri" w:eastAsia="Calibri" w:cs="Calibri"/>
+                <w:color w:val="000000" w:themeColor="text1" w:themeTint="FF" w:themeShade="FF"/>
+              </w:rPr>
+            </w:pPr>
           </w:p>
           <w:p>
             <w:pPr>
@@ -2321,7 +2355,7 @@
         <w:tc>
           <w:tcPr>
             <w:cnfStyle w:val="001000000000" w:firstRow="0" w:lastRow="0" w:firstColumn="1" w:lastColumn="0" w:oddVBand="0" w:evenVBand="0" w:oddHBand="0" w:evenHBand="0" w:firstRowFirstColumn="0" w:firstRowLastColumn="0" w:lastRowFirstColumn="0" w:lastRowLastColumn="0"/>
-            <w:tcW w:w="1125" w:type="dxa"/>
+            <w:tcW w:w="1083" w:type="dxa"/>
             <w:tcMar/>
           </w:tcPr>
           <w:p>
@@ -2344,7 +2378,7 @@
         <w:tc>
           <w:tcPr>
             <w:cnfStyle w:val="000000000000" w:firstRow="0" w:lastRow="0" w:firstColumn="0" w:lastColumn="0" w:oddVBand="0" w:evenVBand="0" w:oddHBand="0" w:evenHBand="0" w:firstRowFirstColumn="0" w:firstRowLastColumn="0" w:lastRowFirstColumn="0" w:lastRowLastColumn="0"/>
-            <w:tcW w:w="5670" w:type="dxa"/>
+            <w:tcW w:w="5712" w:type="dxa"/>
             <w:gridSpan w:val="3"/>
             <w:tcMar/>
           </w:tcPr>
@@ -2447,7 +2481,7 @@
         <w:tc>
           <w:tcPr>
             <w:cnfStyle w:val="001000000000" w:firstRow="0" w:lastRow="0" w:firstColumn="1" w:lastColumn="0" w:oddVBand="0" w:evenVBand="0" w:oddHBand="0" w:evenHBand="0" w:firstRowFirstColumn="0" w:firstRowLastColumn="0" w:lastRowFirstColumn="0" w:lastRowLastColumn="0"/>
-            <w:tcW w:w="1125" w:type="dxa"/>
+            <w:tcW w:w="1083" w:type="dxa"/>
             <w:tcMar/>
           </w:tcPr>
           <w:p>
@@ -2470,7 +2504,7 @@
         <w:tc>
           <w:tcPr>
             <w:cnfStyle w:val="000000000000" w:firstRow="0" w:lastRow="0" w:firstColumn="0" w:lastColumn="0" w:oddVBand="0" w:evenVBand="0" w:oddHBand="0" w:evenHBand="0" w:firstRowFirstColumn="0" w:firstRowLastColumn="0" w:lastRowFirstColumn="0" w:lastRowLastColumn="0"/>
-            <w:tcW w:w="5670" w:type="dxa"/>
+            <w:tcW w:w="5712" w:type="dxa"/>
             <w:gridSpan w:val="3"/>
             <w:shd w:val="clear" w:color="auto" w:fill="FFFFFF" w:themeFill="background1"/>
             <w:tcMar/>
@@ -2542,7 +2576,7 @@
         <w:tc>
           <w:tcPr>
             <w:cnfStyle w:val="001000000000" w:firstRow="0" w:lastRow="0" w:firstColumn="1" w:lastColumn="0" w:oddVBand="0" w:evenVBand="0" w:oddHBand="0" w:evenHBand="0" w:firstRowFirstColumn="0" w:firstRowLastColumn="0" w:lastRowFirstColumn="0" w:lastRowLastColumn="0"/>
-            <w:tcW w:w="1125" w:type="dxa"/>
+            <w:tcW w:w="1083" w:type="dxa"/>
             <w:tcMar/>
           </w:tcPr>
           <w:p>
@@ -2565,7 +2599,7 @@
         <w:tc>
           <w:tcPr>
             <w:cnfStyle w:val="000000000000" w:firstRow="0" w:lastRow="0" w:firstColumn="0" w:lastColumn="0" w:oddVBand="0" w:evenVBand="0" w:oddHBand="0" w:evenHBand="0" w:firstRowFirstColumn="0" w:firstRowLastColumn="0" w:lastRowFirstColumn="0" w:lastRowLastColumn="0"/>
-            <w:tcW w:w="5670" w:type="dxa"/>
+            <w:tcW w:w="5712" w:type="dxa"/>
             <w:gridSpan w:val="3"/>
             <w:shd w:val="clear" w:color="auto" w:fill="FFFFFF" w:themeFill="background1"/>
             <w:tcMar/>
@@ -2654,7 +2688,7 @@
         <w:tc>
           <w:tcPr>
             <w:cnfStyle w:val="001000000000" w:firstRow="0" w:lastRow="0" w:firstColumn="1" w:lastColumn="0" w:oddVBand="0" w:evenVBand="0" w:oddHBand="0" w:evenHBand="0" w:firstRowFirstColumn="0" w:firstRowLastColumn="0" w:lastRowFirstColumn="0" w:lastRowLastColumn="0"/>
-            <w:tcW w:w="1125" w:type="dxa"/>
+            <w:tcW w:w="1083" w:type="dxa"/>
             <w:tcMar/>
           </w:tcPr>
           <w:p>
@@ -2677,7 +2711,7 @@
         <w:tc>
           <w:tcPr>
             <w:cnfStyle w:val="000000000000" w:firstRow="0" w:lastRow="0" w:firstColumn="0" w:lastColumn="0" w:oddVBand="0" w:evenVBand="0" w:oddHBand="0" w:evenHBand="0" w:firstRowFirstColumn="0" w:firstRowLastColumn="0" w:lastRowFirstColumn="0" w:lastRowLastColumn="0"/>
-            <w:tcW w:w="5670" w:type="dxa"/>
+            <w:tcW w:w="5712" w:type="dxa"/>
             <w:gridSpan w:val="3"/>
             <w:shd w:val="clear" w:color="auto" w:fill="FFFFFF" w:themeFill="background1"/>
             <w:tcMar/>
@@ -2749,7 +2783,7 @@
         <w:tc>
           <w:tcPr>
             <w:cnfStyle w:val="001000000000" w:firstRow="0" w:lastRow="0" w:firstColumn="1" w:lastColumn="0" w:oddVBand="0" w:evenVBand="0" w:oddHBand="0" w:evenHBand="0" w:firstRowFirstColumn="0" w:firstRowLastColumn="0" w:lastRowFirstColumn="0" w:lastRowLastColumn="0"/>
-            <w:tcW w:w="1125" w:type="dxa"/>
+            <w:tcW w:w="1083" w:type="dxa"/>
             <w:tcMar/>
           </w:tcPr>
           <w:p>
@@ -2772,7 +2806,7 @@
         <w:tc>
           <w:tcPr>
             <w:cnfStyle w:val="000000000000" w:firstRow="0" w:lastRow="0" w:firstColumn="0" w:lastColumn="0" w:oddVBand="0" w:evenVBand="0" w:oddHBand="0" w:evenHBand="0" w:firstRowFirstColumn="0" w:firstRowLastColumn="0" w:lastRowFirstColumn="0" w:lastRowLastColumn="0"/>
-            <w:tcW w:w="5670" w:type="dxa"/>
+            <w:tcW w:w="5712" w:type="dxa"/>
             <w:gridSpan w:val="3"/>
             <w:shd w:val="clear" w:color="auto" w:fill="FFFFFF" w:themeFill="background1"/>
             <w:tcMar/>
@@ -2890,7 +2924,7 @@
         <w:tc>
           <w:tcPr>
             <w:cnfStyle w:val="001000000000" w:firstRow="0" w:lastRow="0" w:firstColumn="1" w:lastColumn="0" w:oddVBand="0" w:evenVBand="0" w:oddHBand="0" w:evenHBand="0" w:firstRowFirstColumn="0" w:firstRowLastColumn="0" w:lastRowFirstColumn="0" w:lastRowLastColumn="0"/>
-            <w:tcW w:w="2535" w:type="dxa"/>
+            <w:tcW w:w="2428" w:type="dxa"/>
             <w:gridSpan w:val="2"/>
             <w:tcMar/>
           </w:tcPr>
@@ -2914,26 +2948,33 @@
         <w:tc>
           <w:tcPr>
             <w:cnfStyle w:val="000000000000" w:firstRow="0" w:lastRow="0" w:firstColumn="0" w:lastColumn="0" w:oddVBand="0" w:evenVBand="0" w:oddHBand="0" w:evenHBand="0" w:firstRowFirstColumn="0" w:firstRowLastColumn="0" w:lastRowFirstColumn="0" w:lastRowLastColumn="0"/>
-            <w:tcW w:w="7470" w:type="dxa"/>
+            <w:tcW w:w="7577" w:type="dxa"/>
             <w:gridSpan w:val="4"/>
             <w:shd w:val="clear" w:color="auto" w:fill="FFFFFF" w:themeFill="background1"/>
             <w:tcMar/>
           </w:tcPr>
           <w:p>
             <w:pPr>
-              <w:cnfStyle w:val="000000000000" w:firstRow="0" w:lastRow="0" w:firstColumn="0" w:lastColumn="0" w:oddVBand="0" w:evenVBand="0" w:oddHBand="0" w:evenHBand="0" w:firstRowFirstColumn="0" w:firstRowLastColumn="0" w:lastRowFirstColumn="0" w:lastRowLastColumn="0"/>
-              <w:rPr>
-                <w:rFonts w:ascii="Calibri" w:hAnsi="Calibri" w:eastAsia="Calibri" w:cs="Calibri"/>
-                <w:color w:val="000000"/>
-              </w:rPr>
-            </w:pPr>
-            <w:r>
-              <w:rPr>
-                <w:rFonts w:ascii="Calibri" w:hAnsi="Calibri" w:eastAsia="Calibri" w:cs="Calibri"/>
-                <w:color w:val="000000"/>
-              </w:rPr>
-              <w:t>¡Excelente! Te felicito, has seleccionado la respuesta correcta</w:t>
-            </w:r>
+              <w:rPr>
+                <w:rFonts w:ascii="Calibri" w:hAnsi="Calibri" w:eastAsia="Calibri" w:cs="Calibri"/>
+                <w:color w:val="000000" w:themeColor="text1" w:themeTint="FF" w:themeShade="FF"/>
+              </w:rPr>
+            </w:pPr>
+            <w:r>
+              <w:rPr>
+                <w:rFonts w:ascii="Calibri" w:hAnsi="Calibri" w:eastAsia="Calibri" w:cs="Calibri"/>
+                <w:color w:val="000000" w:themeColor="text1" w:themeTint="FF" w:themeShade="FF"/>
+              </w:rPr>
+              <w:t>¡Excelente felicidades!, ha seleccionado la respuesta correcta</w:t>
+            </w:r>
+          </w:p>
+          <w:p>
+            <w:pPr>
+              <w:rPr>
+                <w:rFonts w:ascii="Calibri" w:hAnsi="Calibri" w:eastAsia="Calibri" w:cs="Calibri"/>
+                <w:color w:val="000000" w:themeColor="text1" w:themeTint="FF" w:themeShade="FF"/>
+              </w:rPr>
+            </w:pPr>
           </w:p>
           <w:p>
             <w:pPr>
@@ -2955,7 +2996,7 @@
         <w:tc>
           <w:tcPr>
             <w:cnfStyle w:val="001000000000" w:firstRow="0" w:lastRow="0" w:firstColumn="1" w:lastColumn="0" w:oddVBand="0" w:evenVBand="0" w:oddHBand="0" w:evenHBand="0" w:firstRowFirstColumn="0" w:firstRowLastColumn="0" w:lastRowFirstColumn="0" w:lastRowLastColumn="0"/>
-            <w:tcW w:w="2535" w:type="dxa"/>
+            <w:tcW w:w="2428" w:type="dxa"/>
             <w:gridSpan w:val="2"/>
             <w:tcMar/>
           </w:tcPr>
@@ -2988,26 +3029,33 @@
         <w:tc>
           <w:tcPr>
             <w:cnfStyle w:val="000000000000" w:firstRow="0" w:lastRow="0" w:firstColumn="0" w:lastColumn="0" w:oddVBand="0" w:evenVBand="0" w:oddHBand="0" w:evenHBand="0" w:firstRowFirstColumn="0" w:firstRowLastColumn="0" w:lastRowFirstColumn="0" w:lastRowLastColumn="0"/>
-            <w:tcW w:w="7470" w:type="dxa"/>
+            <w:tcW w:w="7577" w:type="dxa"/>
             <w:gridSpan w:val="4"/>
             <w:shd w:val="clear" w:color="auto" w:fill="FFFFFF" w:themeFill="background1"/>
             <w:tcMar/>
           </w:tcPr>
           <w:p>
             <w:pPr>
-              <w:cnfStyle w:val="000000100000" w:firstRow="0" w:lastRow="0" w:firstColumn="0" w:lastColumn="0" w:oddVBand="0" w:evenVBand="0" w:oddHBand="1" w:evenHBand="0" w:firstRowFirstColumn="0" w:firstRowLastColumn="0" w:lastRowFirstColumn="0" w:lastRowLastColumn="0"/>
-              <w:rPr>
-                <w:rFonts w:ascii="Calibri" w:hAnsi="Calibri" w:eastAsia="Calibri" w:cs="Calibri"/>
-                <w:color w:val="000000"/>
-              </w:rPr>
-            </w:pPr>
-            <w:r>
-              <w:rPr>
-                <w:rFonts w:ascii="Calibri" w:hAnsi="Calibri" w:eastAsia="Calibri" w:cs="Calibri"/>
-                <w:color w:val="000000"/>
-              </w:rPr>
-              <w:t>Te recomendamos volver a revisar el componente formativo e intentar nuevamente la actividad didáctica</w:t>
-            </w:r>
+              <w:rPr>
+                <w:rFonts w:ascii="Calibri" w:hAnsi="Calibri" w:eastAsia="Calibri" w:cs="Calibri"/>
+                <w:color w:val="000000" w:themeColor="text1" w:themeTint="FF" w:themeShade="FF"/>
+              </w:rPr>
+            </w:pPr>
+            <w:r>
+              <w:rPr>
+                <w:rFonts w:ascii="Calibri" w:hAnsi="Calibri" w:eastAsia="Calibri" w:cs="Calibri"/>
+                <w:color w:val="000000" w:themeColor="text1" w:themeTint="FF" w:themeShade="FF"/>
+              </w:rPr>
+              <w:t>Se recomienda volver a revisar el componente formativo e intentar nuevamente la actividad didáctica</w:t>
+            </w:r>
+          </w:p>
+          <w:p>
+            <w:pPr>
+              <w:rPr>
+                <w:rFonts w:ascii="Calibri" w:hAnsi="Calibri" w:eastAsia="Calibri" w:cs="Calibri"/>
+                <w:color w:val="000000" w:themeColor="text1" w:themeTint="FF" w:themeShade="FF"/>
+              </w:rPr>
+            </w:pPr>
           </w:p>
           <w:p>
             <w:pPr>
@@ -3117,7 +3165,7 @@
         <w:tc>
           <w:tcPr>
             <w:cnfStyle w:val="001000000000" w:firstRow="0" w:lastRow="0" w:firstColumn="1" w:lastColumn="0" w:oddVBand="0" w:evenVBand="0" w:oddHBand="0" w:evenHBand="0" w:firstRowFirstColumn="0" w:firstRowLastColumn="0" w:lastRowFirstColumn="0" w:lastRowLastColumn="0"/>
-            <w:tcW w:w="1125" w:type="dxa"/>
+            <w:tcW w:w="1083" w:type="dxa"/>
             <w:tcMar/>
           </w:tcPr>
           <w:p>
@@ -3140,7 +3188,7 @@
         <w:tc>
           <w:tcPr>
             <w:cnfStyle w:val="000000000000" w:firstRow="0" w:lastRow="0" w:firstColumn="0" w:lastColumn="0" w:oddVBand="0" w:evenVBand="0" w:oddHBand="0" w:evenHBand="0" w:firstRowFirstColumn="0" w:firstRowLastColumn="0" w:lastRowFirstColumn="0" w:lastRowLastColumn="0"/>
-            <w:tcW w:w="5670" w:type="dxa"/>
+            <w:tcW w:w="5712" w:type="dxa"/>
             <w:gridSpan w:val="3"/>
             <w:tcMar/>
           </w:tcPr>
@@ -3243,7 +3291,7 @@
         <w:tc>
           <w:tcPr>
             <w:cnfStyle w:val="001000000000" w:firstRow="0" w:lastRow="0" w:firstColumn="1" w:lastColumn="0" w:oddVBand="0" w:evenVBand="0" w:oddHBand="0" w:evenHBand="0" w:firstRowFirstColumn="0" w:firstRowLastColumn="0" w:lastRowFirstColumn="0" w:lastRowLastColumn="0"/>
-            <w:tcW w:w="1125" w:type="dxa"/>
+            <w:tcW w:w="1083" w:type="dxa"/>
             <w:tcMar/>
           </w:tcPr>
           <w:p>
@@ -3266,7 +3314,7 @@
         <w:tc>
           <w:tcPr>
             <w:cnfStyle w:val="000000000000" w:firstRow="0" w:lastRow="0" w:firstColumn="0" w:lastColumn="0" w:oddVBand="0" w:evenVBand="0" w:oddHBand="0" w:evenHBand="0" w:firstRowFirstColumn="0" w:firstRowLastColumn="0" w:lastRowFirstColumn="0" w:lastRowLastColumn="0"/>
-            <w:tcW w:w="5670" w:type="dxa"/>
+            <w:tcW w:w="5712" w:type="dxa"/>
             <w:gridSpan w:val="3"/>
             <w:shd w:val="clear" w:color="auto" w:fill="FFFFFF" w:themeFill="background1"/>
             <w:tcMar/>
@@ -3336,7 +3384,7 @@
         <w:tc>
           <w:tcPr>
             <w:cnfStyle w:val="001000000000" w:firstRow="0" w:lastRow="0" w:firstColumn="1" w:lastColumn="0" w:oddVBand="0" w:evenVBand="0" w:oddHBand="0" w:evenHBand="0" w:firstRowFirstColumn="0" w:firstRowLastColumn="0" w:lastRowFirstColumn="0" w:lastRowLastColumn="0"/>
-            <w:tcW w:w="1125" w:type="dxa"/>
+            <w:tcW w:w="1083" w:type="dxa"/>
             <w:tcMar/>
           </w:tcPr>
           <w:p>
@@ -3359,7 +3407,7 @@
         <w:tc>
           <w:tcPr>
             <w:cnfStyle w:val="000000000000" w:firstRow="0" w:lastRow="0" w:firstColumn="0" w:lastColumn="0" w:oddVBand="0" w:evenVBand="0" w:oddHBand="0" w:evenHBand="0" w:firstRowFirstColumn="0" w:firstRowLastColumn="0" w:lastRowFirstColumn="0" w:lastRowLastColumn="0"/>
-            <w:tcW w:w="5670" w:type="dxa"/>
+            <w:tcW w:w="5712" w:type="dxa"/>
             <w:gridSpan w:val="3"/>
             <w:shd w:val="clear" w:color="auto" w:fill="FFFFFF" w:themeFill="background1"/>
             <w:tcMar/>
@@ -3430,7 +3478,7 @@
         <w:tc>
           <w:tcPr>
             <w:cnfStyle w:val="001000000000" w:firstRow="0" w:lastRow="0" w:firstColumn="1" w:lastColumn="0" w:oddVBand="0" w:evenVBand="0" w:oddHBand="0" w:evenHBand="0" w:firstRowFirstColumn="0" w:firstRowLastColumn="0" w:lastRowFirstColumn="0" w:lastRowLastColumn="0"/>
-            <w:tcW w:w="1125" w:type="dxa"/>
+            <w:tcW w:w="1083" w:type="dxa"/>
             <w:tcMar/>
           </w:tcPr>
           <w:p>
@@ -3453,7 +3501,7 @@
         <w:tc>
           <w:tcPr>
             <w:cnfStyle w:val="000000000000" w:firstRow="0" w:lastRow="0" w:firstColumn="0" w:lastColumn="0" w:oddVBand="0" w:evenVBand="0" w:oddHBand="0" w:evenHBand="0" w:firstRowFirstColumn="0" w:firstRowLastColumn="0" w:lastRowFirstColumn="0" w:lastRowLastColumn="0"/>
-            <w:tcW w:w="5670" w:type="dxa"/>
+            <w:tcW w:w="5712" w:type="dxa"/>
             <w:gridSpan w:val="3"/>
             <w:shd w:val="clear" w:color="auto" w:fill="FFFFFF" w:themeFill="background1"/>
             <w:tcMar/>
@@ -3539,7 +3587,7 @@
         <w:tc>
           <w:tcPr>
             <w:cnfStyle w:val="001000000000" w:firstRow="0" w:lastRow="0" w:firstColumn="1" w:lastColumn="0" w:oddVBand="0" w:evenVBand="0" w:oddHBand="0" w:evenHBand="0" w:firstRowFirstColumn="0" w:firstRowLastColumn="0" w:lastRowFirstColumn="0" w:lastRowLastColumn="0"/>
-            <w:tcW w:w="1125" w:type="dxa"/>
+            <w:tcW w:w="1083" w:type="dxa"/>
             <w:tcMar/>
           </w:tcPr>
           <w:p>
@@ -3562,7 +3610,7 @@
         <w:tc>
           <w:tcPr>
             <w:cnfStyle w:val="000000000000" w:firstRow="0" w:lastRow="0" w:firstColumn="0" w:lastColumn="0" w:oddVBand="0" w:evenVBand="0" w:oddHBand="0" w:evenHBand="0" w:firstRowFirstColumn="0" w:firstRowLastColumn="0" w:lastRowFirstColumn="0" w:lastRowLastColumn="0"/>
-            <w:tcW w:w="5670" w:type="dxa"/>
+            <w:tcW w:w="5712" w:type="dxa"/>
             <w:gridSpan w:val="3"/>
             <w:shd w:val="clear" w:color="auto" w:fill="FFFFFF" w:themeFill="background1"/>
             <w:tcMar/>
@@ -3663,7 +3711,7 @@
         <w:tc>
           <w:tcPr>
             <w:cnfStyle w:val="001000000000" w:firstRow="0" w:lastRow="0" w:firstColumn="1" w:lastColumn="0" w:oddVBand="0" w:evenVBand="0" w:oddHBand="0" w:evenHBand="0" w:firstRowFirstColumn="0" w:firstRowLastColumn="0" w:lastRowFirstColumn="0" w:lastRowLastColumn="0"/>
-            <w:tcW w:w="2535" w:type="dxa"/>
+            <w:tcW w:w="2428" w:type="dxa"/>
             <w:gridSpan w:val="2"/>
             <w:tcMar/>
           </w:tcPr>
@@ -3687,26 +3735,33 @@
         <w:tc>
           <w:tcPr>
             <w:cnfStyle w:val="000000000000" w:firstRow="0" w:lastRow="0" w:firstColumn="0" w:lastColumn="0" w:oddVBand="0" w:evenVBand="0" w:oddHBand="0" w:evenHBand="0" w:firstRowFirstColumn="0" w:firstRowLastColumn="0" w:lastRowFirstColumn="0" w:lastRowLastColumn="0"/>
-            <w:tcW w:w="7470" w:type="dxa"/>
+            <w:tcW w:w="7577" w:type="dxa"/>
             <w:gridSpan w:val="4"/>
             <w:shd w:val="clear" w:color="auto" w:fill="FFFFFF" w:themeFill="background1"/>
             <w:tcMar/>
           </w:tcPr>
           <w:p>
             <w:pPr>
-              <w:cnfStyle w:val="000000000000" w:firstRow="0" w:lastRow="0" w:firstColumn="0" w:lastColumn="0" w:oddVBand="0" w:evenVBand="0" w:oddHBand="0" w:evenHBand="0" w:firstRowFirstColumn="0" w:firstRowLastColumn="0" w:lastRowFirstColumn="0" w:lastRowLastColumn="0"/>
-              <w:rPr>
-                <w:rFonts w:ascii="Calibri" w:hAnsi="Calibri" w:eastAsia="Calibri" w:cs="Calibri"/>
-                <w:color w:val="000000"/>
-              </w:rPr>
-            </w:pPr>
-            <w:r>
-              <w:rPr>
-                <w:rFonts w:ascii="Calibri" w:hAnsi="Calibri" w:eastAsia="Calibri" w:cs="Calibri"/>
-                <w:color w:val="000000"/>
-              </w:rPr>
-              <w:t>¡Excelente! Te felicito, has seleccionado la respuesta correcta</w:t>
-            </w:r>
+              <w:rPr>
+                <w:rFonts w:ascii="Calibri" w:hAnsi="Calibri" w:eastAsia="Calibri" w:cs="Calibri"/>
+                <w:color w:val="000000" w:themeColor="text1" w:themeTint="FF" w:themeShade="FF"/>
+              </w:rPr>
+            </w:pPr>
+            <w:r>
+              <w:rPr>
+                <w:rFonts w:ascii="Calibri" w:hAnsi="Calibri" w:eastAsia="Calibri" w:cs="Calibri"/>
+                <w:color w:val="000000" w:themeColor="text1" w:themeTint="FF" w:themeShade="FF"/>
+              </w:rPr>
+              <w:t>¡Excelente felicidades!, ha seleccionado la respuesta correcta</w:t>
+            </w:r>
+          </w:p>
+          <w:p>
+            <w:pPr>
+              <w:rPr>
+                <w:rFonts w:ascii="Calibri" w:hAnsi="Calibri" w:eastAsia="Calibri" w:cs="Calibri"/>
+                <w:color w:val="000000" w:themeColor="text1" w:themeTint="FF" w:themeShade="FF"/>
+              </w:rPr>
+            </w:pPr>
           </w:p>
           <w:p>
             <w:pPr>
@@ -3728,7 +3783,7 @@
         <w:tc>
           <w:tcPr>
             <w:cnfStyle w:val="001000000000" w:firstRow="0" w:lastRow="0" w:firstColumn="1" w:lastColumn="0" w:oddVBand="0" w:evenVBand="0" w:oddHBand="0" w:evenHBand="0" w:firstRowFirstColumn="0" w:firstRowLastColumn="0" w:lastRowFirstColumn="0" w:lastRowLastColumn="0"/>
-            <w:tcW w:w="2535" w:type="dxa"/>
+            <w:tcW w:w="2428" w:type="dxa"/>
             <w:gridSpan w:val="2"/>
             <w:tcMar/>
           </w:tcPr>
@@ -3760,26 +3815,33 @@
         <w:tc>
           <w:tcPr>
             <w:cnfStyle w:val="000000000000" w:firstRow="0" w:lastRow="0" w:firstColumn="0" w:lastColumn="0" w:oddVBand="0" w:evenVBand="0" w:oddHBand="0" w:evenHBand="0" w:firstRowFirstColumn="0" w:firstRowLastColumn="0" w:lastRowFirstColumn="0" w:lastRowLastColumn="0"/>
-            <w:tcW w:w="7470" w:type="dxa"/>
+            <w:tcW w:w="7577" w:type="dxa"/>
             <w:gridSpan w:val="4"/>
             <w:shd w:val="clear" w:color="auto" w:fill="FFFFFF" w:themeFill="background1"/>
             <w:tcMar/>
           </w:tcPr>
           <w:p>
             <w:pPr>
-              <w:cnfStyle w:val="000000100000" w:firstRow="0" w:lastRow="0" w:firstColumn="0" w:lastColumn="0" w:oddVBand="0" w:evenVBand="0" w:oddHBand="1" w:evenHBand="0" w:firstRowFirstColumn="0" w:firstRowLastColumn="0" w:lastRowFirstColumn="0" w:lastRowLastColumn="0"/>
-              <w:rPr>
-                <w:rFonts w:ascii="Calibri" w:hAnsi="Calibri" w:eastAsia="Calibri" w:cs="Calibri"/>
-                <w:color w:val="000000"/>
-              </w:rPr>
-            </w:pPr>
-            <w:r>
-              <w:rPr>
-                <w:rFonts w:ascii="Calibri" w:hAnsi="Calibri" w:eastAsia="Calibri" w:cs="Calibri"/>
-                <w:color w:val="000000"/>
-              </w:rPr>
-              <w:t>Te recomendamos volver a revisar el componente formativo e intentar nuevamente la actividad didáctica</w:t>
-            </w:r>
+              <w:rPr>
+                <w:rFonts w:ascii="Calibri" w:hAnsi="Calibri" w:eastAsia="Calibri" w:cs="Calibri"/>
+                <w:color w:val="000000" w:themeColor="text1" w:themeTint="FF" w:themeShade="FF"/>
+              </w:rPr>
+            </w:pPr>
+            <w:r>
+              <w:rPr>
+                <w:rFonts w:ascii="Calibri" w:hAnsi="Calibri" w:eastAsia="Calibri" w:cs="Calibri"/>
+                <w:color w:val="000000" w:themeColor="text1" w:themeTint="FF" w:themeShade="FF"/>
+              </w:rPr>
+              <w:t>Se recomienda volver a revisar el componente formativo e intentar nuevamente la actividad didáctica</w:t>
+            </w:r>
+          </w:p>
+          <w:p>
+            <w:pPr>
+              <w:rPr>
+                <w:rFonts w:ascii="Calibri" w:hAnsi="Calibri" w:eastAsia="Calibri" w:cs="Calibri"/>
+                <w:color w:val="000000" w:themeColor="text1" w:themeTint="FF" w:themeShade="FF"/>
+              </w:rPr>
+            </w:pPr>
           </w:p>
           <w:p>
             <w:pPr>
@@ -3891,7 +3953,7 @@
         <w:tc>
           <w:tcPr>
             <w:cnfStyle w:val="001000000000" w:firstRow="0" w:lastRow="0" w:firstColumn="1" w:lastColumn="0" w:oddVBand="0" w:evenVBand="0" w:oddHBand="0" w:evenHBand="0" w:firstRowFirstColumn="0" w:firstRowLastColumn="0" w:lastRowFirstColumn="0" w:lastRowLastColumn="0"/>
-            <w:tcW w:w="1125" w:type="dxa"/>
+            <w:tcW w:w="1083" w:type="dxa"/>
             <w:tcMar/>
           </w:tcPr>
           <w:p>
@@ -3914,7 +3976,7 @@
         <w:tc>
           <w:tcPr>
             <w:cnfStyle w:val="000000000000" w:firstRow="0" w:lastRow="0" w:firstColumn="0" w:lastColumn="0" w:oddVBand="0" w:evenVBand="0" w:oddHBand="0" w:evenHBand="0" w:firstRowFirstColumn="0" w:firstRowLastColumn="0" w:lastRowFirstColumn="0" w:lastRowLastColumn="0"/>
-            <w:tcW w:w="5670" w:type="dxa"/>
+            <w:tcW w:w="5712" w:type="dxa"/>
             <w:gridSpan w:val="3"/>
             <w:tcMar/>
           </w:tcPr>
@@ -4017,7 +4079,7 @@
         <w:tc>
           <w:tcPr>
             <w:cnfStyle w:val="001000000000" w:firstRow="0" w:lastRow="0" w:firstColumn="1" w:lastColumn="0" w:oddVBand="0" w:evenVBand="0" w:oddHBand="0" w:evenHBand="0" w:firstRowFirstColumn="0" w:firstRowLastColumn="0" w:lastRowFirstColumn="0" w:lastRowLastColumn="0"/>
-            <w:tcW w:w="1125" w:type="dxa"/>
+            <w:tcW w:w="1083" w:type="dxa"/>
             <w:tcMar/>
           </w:tcPr>
           <w:p>
@@ -4040,7 +4102,7 @@
         <w:tc>
           <w:tcPr>
             <w:cnfStyle w:val="000000000000" w:firstRow="0" w:lastRow="0" w:firstColumn="0" w:lastColumn="0" w:oddVBand="0" w:evenVBand="0" w:oddHBand="0" w:evenHBand="0" w:firstRowFirstColumn="0" w:firstRowLastColumn="0" w:lastRowFirstColumn="0" w:lastRowLastColumn="0"/>
-            <w:tcW w:w="5670" w:type="dxa"/>
+            <w:tcW w:w="5712" w:type="dxa"/>
             <w:gridSpan w:val="3"/>
             <w:shd w:val="clear" w:color="auto" w:fill="FFFFFF" w:themeFill="background1"/>
             <w:tcMar/>
@@ -4110,7 +4172,7 @@
         <w:tc>
           <w:tcPr>
             <w:cnfStyle w:val="001000000000" w:firstRow="0" w:lastRow="0" w:firstColumn="1" w:lastColumn="0" w:oddVBand="0" w:evenVBand="0" w:oddHBand="0" w:evenHBand="0" w:firstRowFirstColumn="0" w:firstRowLastColumn="0" w:lastRowFirstColumn="0" w:lastRowLastColumn="0"/>
-            <w:tcW w:w="1125" w:type="dxa"/>
+            <w:tcW w:w="1083" w:type="dxa"/>
             <w:tcMar/>
           </w:tcPr>
           <w:p>
@@ -4133,7 +4195,7 @@
         <w:tc>
           <w:tcPr>
             <w:cnfStyle w:val="000000000000" w:firstRow="0" w:lastRow="0" w:firstColumn="0" w:lastColumn="0" w:oddVBand="0" w:evenVBand="0" w:oddHBand="0" w:evenHBand="0" w:firstRowFirstColumn="0" w:firstRowLastColumn="0" w:lastRowFirstColumn="0" w:lastRowLastColumn="0"/>
-            <w:tcW w:w="5670" w:type="dxa"/>
+            <w:tcW w:w="5712" w:type="dxa"/>
             <w:gridSpan w:val="3"/>
             <w:shd w:val="clear" w:color="auto" w:fill="FFFFFF" w:themeFill="background1"/>
             <w:tcMar/>
@@ -4201,7 +4263,7 @@
         <w:tc>
           <w:tcPr>
             <w:cnfStyle w:val="001000000000" w:firstRow="0" w:lastRow="0" w:firstColumn="1" w:lastColumn="0" w:oddVBand="0" w:evenVBand="0" w:oddHBand="0" w:evenHBand="0" w:firstRowFirstColumn="0" w:firstRowLastColumn="0" w:lastRowFirstColumn="0" w:lastRowLastColumn="0"/>
-            <w:tcW w:w="1125" w:type="dxa"/>
+            <w:tcW w:w="1083" w:type="dxa"/>
             <w:tcMar/>
           </w:tcPr>
           <w:p>
@@ -4224,7 +4286,7 @@
         <w:tc>
           <w:tcPr>
             <w:cnfStyle w:val="000000000000" w:firstRow="0" w:lastRow="0" w:firstColumn="0" w:lastColumn="0" w:oddVBand="0" w:evenVBand="0" w:oddHBand="0" w:evenHBand="0" w:firstRowFirstColumn="0" w:firstRowLastColumn="0" w:lastRowFirstColumn="0" w:lastRowLastColumn="0"/>
-            <w:tcW w:w="5670" w:type="dxa"/>
+            <w:tcW w:w="5712" w:type="dxa"/>
             <w:gridSpan w:val="3"/>
             <w:shd w:val="clear" w:color="auto" w:fill="FFFFFF" w:themeFill="background1"/>
             <w:tcMar/>
@@ -4310,7 +4372,7 @@
         <w:tc>
           <w:tcPr>
             <w:cnfStyle w:val="001000000000" w:firstRow="0" w:lastRow="0" w:firstColumn="1" w:lastColumn="0" w:oddVBand="0" w:evenVBand="0" w:oddHBand="0" w:evenHBand="0" w:firstRowFirstColumn="0" w:firstRowLastColumn="0" w:lastRowFirstColumn="0" w:lastRowLastColumn="0"/>
-            <w:tcW w:w="1125" w:type="dxa"/>
+            <w:tcW w:w="1083" w:type="dxa"/>
             <w:tcMar/>
           </w:tcPr>
           <w:p>
@@ -4333,7 +4395,7 @@
         <w:tc>
           <w:tcPr>
             <w:cnfStyle w:val="000000000000" w:firstRow="0" w:lastRow="0" w:firstColumn="0" w:lastColumn="0" w:oddVBand="0" w:evenVBand="0" w:oddHBand="0" w:evenHBand="0" w:firstRowFirstColumn="0" w:firstRowLastColumn="0" w:lastRowFirstColumn="0" w:lastRowLastColumn="0"/>
-            <w:tcW w:w="5670" w:type="dxa"/>
+            <w:tcW w:w="5712" w:type="dxa"/>
             <w:gridSpan w:val="3"/>
             <w:shd w:val="clear" w:color="auto" w:fill="FFFFFF" w:themeFill="background1"/>
             <w:tcMar/>
@@ -4434,7 +4496,7 @@
         <w:tc>
           <w:tcPr>
             <w:cnfStyle w:val="001000000000" w:firstRow="0" w:lastRow="0" w:firstColumn="1" w:lastColumn="0" w:oddVBand="0" w:evenVBand="0" w:oddHBand="0" w:evenHBand="0" w:firstRowFirstColumn="0" w:firstRowLastColumn="0" w:lastRowFirstColumn="0" w:lastRowLastColumn="0"/>
-            <w:tcW w:w="2535" w:type="dxa"/>
+            <w:tcW w:w="2428" w:type="dxa"/>
             <w:gridSpan w:val="2"/>
             <w:tcMar/>
           </w:tcPr>
@@ -4458,26 +4520,33 @@
         <w:tc>
           <w:tcPr>
             <w:cnfStyle w:val="000000000000" w:firstRow="0" w:lastRow="0" w:firstColumn="0" w:lastColumn="0" w:oddVBand="0" w:evenVBand="0" w:oddHBand="0" w:evenHBand="0" w:firstRowFirstColumn="0" w:firstRowLastColumn="0" w:lastRowFirstColumn="0" w:lastRowLastColumn="0"/>
-            <w:tcW w:w="7470" w:type="dxa"/>
+            <w:tcW w:w="7577" w:type="dxa"/>
             <w:gridSpan w:val="4"/>
             <w:shd w:val="clear" w:color="auto" w:fill="FFFFFF" w:themeFill="background1"/>
             <w:tcMar/>
           </w:tcPr>
           <w:p>
             <w:pPr>
-              <w:cnfStyle w:val="000000000000" w:firstRow="0" w:lastRow="0" w:firstColumn="0" w:lastColumn="0" w:oddVBand="0" w:evenVBand="0" w:oddHBand="0" w:evenHBand="0" w:firstRowFirstColumn="0" w:firstRowLastColumn="0" w:lastRowFirstColumn="0" w:lastRowLastColumn="0"/>
-              <w:rPr>
-                <w:rFonts w:ascii="Calibri" w:hAnsi="Calibri" w:eastAsia="Calibri" w:cs="Calibri"/>
-                <w:color w:val="000000"/>
-              </w:rPr>
-            </w:pPr>
-            <w:r>
-              <w:rPr>
-                <w:rFonts w:ascii="Calibri" w:hAnsi="Calibri" w:eastAsia="Calibri" w:cs="Calibri"/>
-                <w:color w:val="000000"/>
-              </w:rPr>
-              <w:t>¡Excelente! Te felicito, has seleccionado la respuesta correcta</w:t>
-            </w:r>
+              <w:rPr>
+                <w:rFonts w:ascii="Calibri" w:hAnsi="Calibri" w:eastAsia="Calibri" w:cs="Calibri"/>
+                <w:color w:val="000000" w:themeColor="text1" w:themeTint="FF" w:themeShade="FF"/>
+              </w:rPr>
+            </w:pPr>
+            <w:r>
+              <w:rPr>
+                <w:rFonts w:ascii="Calibri" w:hAnsi="Calibri" w:eastAsia="Calibri" w:cs="Calibri"/>
+                <w:color w:val="000000" w:themeColor="text1" w:themeTint="FF" w:themeShade="FF"/>
+              </w:rPr>
+              <w:t>¡Excelente felicidades!, ha seleccionado la respuesta correcta</w:t>
+            </w:r>
+          </w:p>
+          <w:p>
+            <w:pPr>
+              <w:rPr>
+                <w:rFonts w:ascii="Calibri" w:hAnsi="Calibri" w:eastAsia="Calibri" w:cs="Calibri"/>
+                <w:color w:val="000000" w:themeColor="text1" w:themeTint="FF" w:themeShade="FF"/>
+              </w:rPr>
+            </w:pPr>
           </w:p>
           <w:p>
             <w:pPr>
@@ -4499,7 +4568,7 @@
         <w:tc>
           <w:tcPr>
             <w:cnfStyle w:val="001000000000" w:firstRow="0" w:lastRow="0" w:firstColumn="1" w:lastColumn="0" w:oddVBand="0" w:evenVBand="0" w:oddHBand="0" w:evenHBand="0" w:firstRowFirstColumn="0" w:firstRowLastColumn="0" w:lastRowFirstColumn="0" w:lastRowLastColumn="0"/>
-            <w:tcW w:w="2535" w:type="dxa"/>
+            <w:tcW w:w="2428" w:type="dxa"/>
             <w:gridSpan w:val="2"/>
             <w:tcMar/>
           </w:tcPr>
@@ -4531,26 +4600,33 @@
         <w:tc>
           <w:tcPr>
             <w:cnfStyle w:val="000000000000" w:firstRow="0" w:lastRow="0" w:firstColumn="0" w:lastColumn="0" w:oddVBand="0" w:evenVBand="0" w:oddHBand="0" w:evenHBand="0" w:firstRowFirstColumn="0" w:firstRowLastColumn="0" w:lastRowFirstColumn="0" w:lastRowLastColumn="0"/>
-            <w:tcW w:w="7470" w:type="dxa"/>
+            <w:tcW w:w="7577" w:type="dxa"/>
             <w:gridSpan w:val="4"/>
             <w:shd w:val="clear" w:color="auto" w:fill="FFFFFF" w:themeFill="background1"/>
             <w:tcMar/>
           </w:tcPr>
           <w:p>
             <w:pPr>
-              <w:cnfStyle w:val="000000100000" w:firstRow="0" w:lastRow="0" w:firstColumn="0" w:lastColumn="0" w:oddVBand="0" w:evenVBand="0" w:oddHBand="1" w:evenHBand="0" w:firstRowFirstColumn="0" w:firstRowLastColumn="0" w:lastRowFirstColumn="0" w:lastRowLastColumn="0"/>
-              <w:rPr>
-                <w:rFonts w:ascii="Calibri" w:hAnsi="Calibri" w:eastAsia="Calibri" w:cs="Calibri"/>
-                <w:color w:val="000000"/>
-              </w:rPr>
-            </w:pPr>
-            <w:r>
-              <w:rPr>
-                <w:rFonts w:ascii="Calibri" w:hAnsi="Calibri" w:eastAsia="Calibri" w:cs="Calibri"/>
-                <w:color w:val="000000"/>
-              </w:rPr>
-              <w:t>Te recomendamos volver a revisar el componente formativo e intentar nuevamente la actividad didáctica</w:t>
-            </w:r>
+              <w:rPr>
+                <w:rFonts w:ascii="Calibri" w:hAnsi="Calibri" w:eastAsia="Calibri" w:cs="Calibri"/>
+                <w:color w:val="000000" w:themeColor="text1" w:themeTint="FF" w:themeShade="FF"/>
+              </w:rPr>
+            </w:pPr>
+            <w:r>
+              <w:rPr>
+                <w:rFonts w:ascii="Calibri" w:hAnsi="Calibri" w:eastAsia="Calibri" w:cs="Calibri"/>
+                <w:color w:val="000000" w:themeColor="text1" w:themeTint="FF" w:themeShade="FF"/>
+              </w:rPr>
+              <w:t>Se recomienda volver a revisar el componente formativo e intentar nuevamente la actividad didáctica</w:t>
+            </w:r>
+          </w:p>
+          <w:p>
+            <w:pPr>
+              <w:rPr>
+                <w:rFonts w:ascii="Calibri" w:hAnsi="Calibri" w:eastAsia="Calibri" w:cs="Calibri"/>
+                <w:color w:val="000000" w:themeColor="text1" w:themeTint="FF" w:themeShade="FF"/>
+              </w:rPr>
+            </w:pPr>
           </w:p>
           <w:p>
             <w:pPr>
@@ -4662,7 +4738,7 @@
         <w:tc>
           <w:tcPr>
             <w:cnfStyle w:val="001000000000" w:firstRow="0" w:lastRow="0" w:firstColumn="1" w:lastColumn="0" w:oddVBand="0" w:evenVBand="0" w:oddHBand="0" w:evenHBand="0" w:firstRowFirstColumn="0" w:firstRowLastColumn="0" w:lastRowFirstColumn="0" w:lastRowLastColumn="0"/>
-            <w:tcW w:w="1125" w:type="dxa"/>
+            <w:tcW w:w="1083" w:type="dxa"/>
             <w:tcMar/>
           </w:tcPr>
           <w:p>
@@ -4685,7 +4761,7 @@
         <w:tc>
           <w:tcPr>
             <w:cnfStyle w:val="000000000000" w:firstRow="0" w:lastRow="0" w:firstColumn="0" w:lastColumn="0" w:oddVBand="0" w:evenVBand="0" w:oddHBand="0" w:evenHBand="0" w:firstRowFirstColumn="0" w:firstRowLastColumn="0" w:lastRowFirstColumn="0" w:lastRowLastColumn="0"/>
-            <w:tcW w:w="5670" w:type="dxa"/>
+            <w:tcW w:w="5712" w:type="dxa"/>
             <w:gridSpan w:val="3"/>
             <w:tcMar/>
           </w:tcPr>
@@ -4788,7 +4864,7 @@
         <w:tc>
           <w:tcPr>
             <w:cnfStyle w:val="001000000000" w:firstRow="0" w:lastRow="0" w:firstColumn="1" w:lastColumn="0" w:oddVBand="0" w:evenVBand="0" w:oddHBand="0" w:evenHBand="0" w:firstRowFirstColumn="0" w:firstRowLastColumn="0" w:lastRowFirstColumn="0" w:lastRowLastColumn="0"/>
-            <w:tcW w:w="1125" w:type="dxa"/>
+            <w:tcW w:w="1083" w:type="dxa"/>
             <w:tcMar/>
           </w:tcPr>
           <w:p>
@@ -4811,7 +4887,7 @@
         <w:tc>
           <w:tcPr>
             <w:cnfStyle w:val="000000000000" w:firstRow="0" w:lastRow="0" w:firstColumn="0" w:lastColumn="0" w:oddVBand="0" w:evenVBand="0" w:oddHBand="0" w:evenHBand="0" w:firstRowFirstColumn="0" w:firstRowLastColumn="0" w:lastRowFirstColumn="0" w:lastRowLastColumn="0"/>
-            <w:tcW w:w="5670" w:type="dxa"/>
+            <w:tcW w:w="5712" w:type="dxa"/>
             <w:gridSpan w:val="3"/>
             <w:shd w:val="clear" w:color="auto" w:fill="FFFFFF" w:themeFill="background1"/>
             <w:tcMar/>
@@ -4881,7 +4957,7 @@
         <w:tc>
           <w:tcPr>
             <w:cnfStyle w:val="001000000000" w:firstRow="0" w:lastRow="0" w:firstColumn="1" w:lastColumn="0" w:oddVBand="0" w:evenVBand="0" w:oddHBand="0" w:evenHBand="0" w:firstRowFirstColumn="0" w:firstRowLastColumn="0" w:lastRowFirstColumn="0" w:lastRowLastColumn="0"/>
-            <w:tcW w:w="1125" w:type="dxa"/>
+            <w:tcW w:w="1083" w:type="dxa"/>
             <w:tcMar/>
           </w:tcPr>
           <w:p>
@@ -4904,7 +4980,7 @@
         <w:tc>
           <w:tcPr>
             <w:cnfStyle w:val="000000000000" w:firstRow="0" w:lastRow="0" w:firstColumn="0" w:lastColumn="0" w:oddVBand="0" w:evenVBand="0" w:oddHBand="0" w:evenHBand="0" w:firstRowFirstColumn="0" w:firstRowLastColumn="0" w:lastRowFirstColumn="0" w:lastRowLastColumn="0"/>
-            <w:tcW w:w="5670" w:type="dxa"/>
+            <w:tcW w:w="5712" w:type="dxa"/>
             <w:gridSpan w:val="3"/>
             <w:shd w:val="clear" w:color="auto" w:fill="FFFFFF" w:themeFill="background1"/>
             <w:tcMar/>
@@ -4975,7 +5051,7 @@
         <w:tc>
           <w:tcPr>
             <w:cnfStyle w:val="001000000000" w:firstRow="0" w:lastRow="0" w:firstColumn="1" w:lastColumn="0" w:oddVBand="0" w:evenVBand="0" w:oddHBand="0" w:evenHBand="0" w:firstRowFirstColumn="0" w:firstRowLastColumn="0" w:lastRowFirstColumn="0" w:lastRowLastColumn="0"/>
-            <w:tcW w:w="1125" w:type="dxa"/>
+            <w:tcW w:w="1083" w:type="dxa"/>
             <w:tcMar/>
           </w:tcPr>
           <w:p>
@@ -4998,7 +5074,7 @@
         <w:tc>
           <w:tcPr>
             <w:cnfStyle w:val="000000000000" w:firstRow="0" w:lastRow="0" w:firstColumn="0" w:lastColumn="0" w:oddVBand="0" w:evenVBand="0" w:oddHBand="0" w:evenHBand="0" w:firstRowFirstColumn="0" w:firstRowLastColumn="0" w:lastRowFirstColumn="0" w:lastRowLastColumn="0"/>
-            <w:tcW w:w="5670" w:type="dxa"/>
+            <w:tcW w:w="5712" w:type="dxa"/>
             <w:gridSpan w:val="3"/>
             <w:shd w:val="clear" w:color="auto" w:fill="FFFFFF" w:themeFill="background1"/>
             <w:tcMar/>
@@ -5084,7 +5160,7 @@
         <w:tc>
           <w:tcPr>
             <w:cnfStyle w:val="001000000000" w:firstRow="0" w:lastRow="0" w:firstColumn="1" w:lastColumn="0" w:oddVBand="0" w:evenVBand="0" w:oddHBand="0" w:evenHBand="0" w:firstRowFirstColumn="0" w:firstRowLastColumn="0" w:lastRowFirstColumn="0" w:lastRowLastColumn="0"/>
-            <w:tcW w:w="1125" w:type="dxa"/>
+            <w:tcW w:w="1083" w:type="dxa"/>
             <w:tcMar/>
           </w:tcPr>
           <w:p>
@@ -5107,7 +5183,7 @@
         <w:tc>
           <w:tcPr>
             <w:cnfStyle w:val="000000000000" w:firstRow="0" w:lastRow="0" w:firstColumn="0" w:lastColumn="0" w:oddVBand="0" w:evenVBand="0" w:oddHBand="0" w:evenHBand="0" w:firstRowFirstColumn="0" w:firstRowLastColumn="0" w:lastRowFirstColumn="0" w:lastRowLastColumn="0"/>
-            <w:tcW w:w="5670" w:type="dxa"/>
+            <w:tcW w:w="5712" w:type="dxa"/>
             <w:gridSpan w:val="3"/>
             <w:shd w:val="clear" w:color="auto" w:fill="FFFFFF" w:themeFill="background1"/>
             <w:tcMar/>
@@ -5208,7 +5284,7 @@
         <w:tc>
           <w:tcPr>
             <w:cnfStyle w:val="001000000000" w:firstRow="0" w:lastRow="0" w:firstColumn="1" w:lastColumn="0" w:oddVBand="0" w:evenVBand="0" w:oddHBand="0" w:evenHBand="0" w:firstRowFirstColumn="0" w:firstRowLastColumn="0" w:lastRowFirstColumn="0" w:lastRowLastColumn="0"/>
-            <w:tcW w:w="2535" w:type="dxa"/>
+            <w:tcW w:w="2428" w:type="dxa"/>
             <w:gridSpan w:val="2"/>
             <w:tcMar/>
           </w:tcPr>
@@ -5232,26 +5308,33 @@
         <w:tc>
           <w:tcPr>
             <w:cnfStyle w:val="000000000000" w:firstRow="0" w:lastRow="0" w:firstColumn="0" w:lastColumn="0" w:oddVBand="0" w:evenVBand="0" w:oddHBand="0" w:evenHBand="0" w:firstRowFirstColumn="0" w:firstRowLastColumn="0" w:lastRowFirstColumn="0" w:lastRowLastColumn="0"/>
-            <w:tcW w:w="7470" w:type="dxa"/>
+            <w:tcW w:w="7577" w:type="dxa"/>
             <w:gridSpan w:val="4"/>
             <w:shd w:val="clear" w:color="auto" w:fill="FFFFFF" w:themeFill="background1"/>
             <w:tcMar/>
           </w:tcPr>
           <w:p>
             <w:pPr>
-              <w:cnfStyle w:val="000000000000" w:firstRow="0" w:lastRow="0" w:firstColumn="0" w:lastColumn="0" w:oddVBand="0" w:evenVBand="0" w:oddHBand="0" w:evenHBand="0" w:firstRowFirstColumn="0" w:firstRowLastColumn="0" w:lastRowFirstColumn="0" w:lastRowLastColumn="0"/>
-              <w:rPr>
-                <w:rFonts w:ascii="Calibri" w:hAnsi="Calibri" w:eastAsia="Calibri" w:cs="Calibri"/>
-                <w:color w:val="000000"/>
-              </w:rPr>
-            </w:pPr>
-            <w:r>
-              <w:rPr>
-                <w:rFonts w:ascii="Calibri" w:hAnsi="Calibri" w:eastAsia="Calibri" w:cs="Calibri"/>
-                <w:color w:val="000000"/>
-              </w:rPr>
-              <w:t>¡Excelente! Te felicito, has seleccionado la respuesta correcta</w:t>
-            </w:r>
+              <w:rPr>
+                <w:rFonts w:ascii="Calibri" w:hAnsi="Calibri" w:eastAsia="Calibri" w:cs="Calibri"/>
+                <w:color w:val="000000" w:themeColor="text1" w:themeTint="FF" w:themeShade="FF"/>
+              </w:rPr>
+            </w:pPr>
+            <w:r>
+              <w:rPr>
+                <w:rFonts w:ascii="Calibri" w:hAnsi="Calibri" w:eastAsia="Calibri" w:cs="Calibri"/>
+                <w:color w:val="000000" w:themeColor="text1" w:themeTint="FF" w:themeShade="FF"/>
+              </w:rPr>
+              <w:t>¡Excelente felicidades!, ha seleccionado la respuesta correcta</w:t>
+            </w:r>
+          </w:p>
+          <w:p>
+            <w:pPr>
+              <w:rPr>
+                <w:rFonts w:ascii="Calibri" w:hAnsi="Calibri" w:eastAsia="Calibri" w:cs="Calibri"/>
+                <w:color w:val="000000" w:themeColor="text1" w:themeTint="FF" w:themeShade="FF"/>
+              </w:rPr>
+            </w:pPr>
           </w:p>
           <w:p>
             <w:pPr>
@@ -5273,7 +5356,7 @@
         <w:tc>
           <w:tcPr>
             <w:cnfStyle w:val="001000000000" w:firstRow="0" w:lastRow="0" w:firstColumn="1" w:lastColumn="0" w:oddVBand="0" w:evenVBand="0" w:oddHBand="0" w:evenHBand="0" w:firstRowFirstColumn="0" w:firstRowLastColumn="0" w:lastRowFirstColumn="0" w:lastRowLastColumn="0"/>
-            <w:tcW w:w="2535" w:type="dxa"/>
+            <w:tcW w:w="2428" w:type="dxa"/>
             <w:gridSpan w:val="2"/>
             <w:tcMar/>
           </w:tcPr>
@@ -5305,26 +5388,33 @@
         <w:tc>
           <w:tcPr>
             <w:cnfStyle w:val="000000000000" w:firstRow="0" w:lastRow="0" w:firstColumn="0" w:lastColumn="0" w:oddVBand="0" w:evenVBand="0" w:oddHBand="0" w:evenHBand="0" w:firstRowFirstColumn="0" w:firstRowLastColumn="0" w:lastRowFirstColumn="0" w:lastRowLastColumn="0"/>
-            <w:tcW w:w="7470" w:type="dxa"/>
+            <w:tcW w:w="7577" w:type="dxa"/>
             <w:gridSpan w:val="4"/>
             <w:shd w:val="clear" w:color="auto" w:fill="FFFFFF" w:themeFill="background1"/>
             <w:tcMar/>
           </w:tcPr>
           <w:p>
             <w:pPr>
-              <w:cnfStyle w:val="000000100000" w:firstRow="0" w:lastRow="0" w:firstColumn="0" w:lastColumn="0" w:oddVBand="0" w:evenVBand="0" w:oddHBand="1" w:evenHBand="0" w:firstRowFirstColumn="0" w:firstRowLastColumn="0" w:lastRowFirstColumn="0" w:lastRowLastColumn="0"/>
-              <w:rPr>
-                <w:rFonts w:ascii="Calibri" w:hAnsi="Calibri" w:eastAsia="Calibri" w:cs="Calibri"/>
-                <w:color w:val="000000"/>
-              </w:rPr>
-            </w:pPr>
-            <w:r>
-              <w:rPr>
-                <w:rFonts w:ascii="Calibri" w:hAnsi="Calibri" w:eastAsia="Calibri" w:cs="Calibri"/>
-                <w:color w:val="000000"/>
-              </w:rPr>
-              <w:t>Te recomendamos volver a revisar el componente formativo e intentar nuevamente la actividad didáctica</w:t>
-            </w:r>
+              <w:rPr>
+                <w:rFonts w:ascii="Calibri" w:hAnsi="Calibri" w:eastAsia="Calibri" w:cs="Calibri"/>
+                <w:color w:val="000000" w:themeColor="text1" w:themeTint="FF" w:themeShade="FF"/>
+              </w:rPr>
+            </w:pPr>
+            <w:r>
+              <w:rPr>
+                <w:rFonts w:ascii="Calibri" w:hAnsi="Calibri" w:eastAsia="Calibri" w:cs="Calibri"/>
+                <w:color w:val="000000" w:themeColor="text1" w:themeTint="FF" w:themeShade="FF"/>
+              </w:rPr>
+              <w:t>Se recomienda volver a revisar el componente formativo e intentar nuevamente la actividad didáctica</w:t>
+            </w:r>
+          </w:p>
+          <w:p>
+            <w:pPr>
+              <w:rPr>
+                <w:rFonts w:ascii="Calibri" w:hAnsi="Calibri" w:eastAsia="Calibri" w:cs="Calibri"/>
+                <w:color w:val="000000" w:themeColor="text1" w:themeTint="FF" w:themeShade="FF"/>
+              </w:rPr>
+            </w:pPr>
           </w:p>
           <w:p>
             <w:pPr>
@@ -5436,7 +5526,7 @@
         <w:tc>
           <w:tcPr>
             <w:cnfStyle w:val="001000000000" w:firstRow="0" w:lastRow="0" w:firstColumn="1" w:lastColumn="0" w:oddVBand="0" w:evenVBand="0" w:oddHBand="0" w:evenHBand="0" w:firstRowFirstColumn="0" w:firstRowLastColumn="0" w:lastRowFirstColumn="0" w:lastRowLastColumn="0"/>
-            <w:tcW w:w="1125" w:type="dxa"/>
+            <w:tcW w:w="1083" w:type="dxa"/>
             <w:tcMar/>
           </w:tcPr>
           <w:p>
@@ -5459,7 +5549,7 @@
         <w:tc>
           <w:tcPr>
             <w:cnfStyle w:val="000000000000" w:firstRow="0" w:lastRow="0" w:firstColumn="0" w:lastColumn="0" w:oddVBand="0" w:evenVBand="0" w:oddHBand="0" w:evenHBand="0" w:firstRowFirstColumn="0" w:firstRowLastColumn="0" w:lastRowFirstColumn="0" w:lastRowLastColumn="0"/>
-            <w:tcW w:w="5670" w:type="dxa"/>
+            <w:tcW w:w="5712" w:type="dxa"/>
             <w:gridSpan w:val="3"/>
             <w:tcMar/>
           </w:tcPr>
@@ -5562,7 +5652,7 @@
         <w:tc>
           <w:tcPr>
             <w:cnfStyle w:val="001000000000" w:firstRow="0" w:lastRow="0" w:firstColumn="1" w:lastColumn="0" w:oddVBand="0" w:evenVBand="0" w:oddHBand="0" w:evenHBand="0" w:firstRowFirstColumn="0" w:firstRowLastColumn="0" w:lastRowFirstColumn="0" w:lastRowLastColumn="0"/>
-            <w:tcW w:w="1125" w:type="dxa"/>
+            <w:tcW w:w="1083" w:type="dxa"/>
             <w:tcMar/>
           </w:tcPr>
           <w:p>
@@ -5585,7 +5675,7 @@
         <w:tc>
           <w:tcPr>
             <w:cnfStyle w:val="000000000000" w:firstRow="0" w:lastRow="0" w:firstColumn="0" w:lastColumn="0" w:oddVBand="0" w:evenVBand="0" w:oddHBand="0" w:evenHBand="0" w:firstRowFirstColumn="0" w:firstRowLastColumn="0" w:lastRowFirstColumn="0" w:lastRowLastColumn="0"/>
-            <w:tcW w:w="5670" w:type="dxa"/>
+            <w:tcW w:w="5712" w:type="dxa"/>
             <w:gridSpan w:val="3"/>
             <w:shd w:val="clear" w:color="auto" w:fill="FFFFFF" w:themeFill="background1"/>
             <w:tcMar/>
@@ -5665,7 +5755,7 @@
         <w:tc>
           <w:tcPr>
             <w:cnfStyle w:val="001000000000" w:firstRow="0" w:lastRow="0" w:firstColumn="1" w:lastColumn="0" w:oddVBand="0" w:evenVBand="0" w:oddHBand="0" w:evenHBand="0" w:firstRowFirstColumn="0" w:firstRowLastColumn="0" w:lastRowFirstColumn="0" w:lastRowLastColumn="0"/>
-            <w:tcW w:w="1125" w:type="dxa"/>
+            <w:tcW w:w="1083" w:type="dxa"/>
             <w:tcMar/>
           </w:tcPr>
           <w:p>
@@ -5688,7 +5778,7 @@
         <w:tc>
           <w:tcPr>
             <w:cnfStyle w:val="000000000000" w:firstRow="0" w:lastRow="0" w:firstColumn="0" w:lastColumn="0" w:oddVBand="0" w:evenVBand="0" w:oddHBand="0" w:evenHBand="0" w:firstRowFirstColumn="0" w:firstRowLastColumn="0" w:lastRowFirstColumn="0" w:lastRowLastColumn="0"/>
-            <w:tcW w:w="5670" w:type="dxa"/>
+            <w:tcW w:w="5712" w:type="dxa"/>
             <w:gridSpan w:val="3"/>
             <w:shd w:val="clear" w:color="auto" w:fill="FFFFFF" w:themeFill="background1"/>
             <w:tcMar/>
@@ -5777,7 +5867,7 @@
         <w:tc>
           <w:tcPr>
             <w:cnfStyle w:val="001000000000" w:firstRow="0" w:lastRow="0" w:firstColumn="1" w:lastColumn="0" w:oddVBand="0" w:evenVBand="0" w:oddHBand="0" w:evenHBand="0" w:firstRowFirstColumn="0" w:firstRowLastColumn="0" w:lastRowFirstColumn="0" w:lastRowLastColumn="0"/>
-            <w:tcW w:w="1125" w:type="dxa"/>
+            <w:tcW w:w="1083" w:type="dxa"/>
             <w:tcMar/>
           </w:tcPr>
           <w:p>
@@ -5800,7 +5890,7 @@
         <w:tc>
           <w:tcPr>
             <w:cnfStyle w:val="000000000000" w:firstRow="0" w:lastRow="0" w:firstColumn="0" w:lastColumn="0" w:oddVBand="0" w:evenVBand="0" w:oddHBand="0" w:evenHBand="0" w:firstRowFirstColumn="0" w:firstRowLastColumn="0" w:lastRowFirstColumn="0" w:lastRowLastColumn="0"/>
-            <w:tcW w:w="5670" w:type="dxa"/>
+            <w:tcW w:w="5712" w:type="dxa"/>
             <w:gridSpan w:val="3"/>
             <w:shd w:val="clear" w:color="auto" w:fill="FFFFFF" w:themeFill="background1"/>
             <w:tcMar/>
@@ -5869,7 +5959,7 @@
         <w:tc>
           <w:tcPr>
             <w:cnfStyle w:val="001000000000" w:firstRow="0" w:lastRow="0" w:firstColumn="1" w:lastColumn="0" w:oddVBand="0" w:evenVBand="0" w:oddHBand="0" w:evenHBand="0" w:firstRowFirstColumn="0" w:firstRowLastColumn="0" w:lastRowFirstColumn="0" w:lastRowLastColumn="0"/>
-            <w:tcW w:w="1125" w:type="dxa"/>
+            <w:tcW w:w="1083" w:type="dxa"/>
             <w:tcMar/>
           </w:tcPr>
           <w:p>
@@ -5892,7 +5982,7 @@
         <w:tc>
           <w:tcPr>
             <w:cnfStyle w:val="000000000000" w:firstRow="0" w:lastRow="0" w:firstColumn="0" w:lastColumn="0" w:oddVBand="0" w:evenVBand="0" w:oddHBand="0" w:evenHBand="0" w:firstRowFirstColumn="0" w:firstRowLastColumn="0" w:lastRowFirstColumn="0" w:lastRowLastColumn="0"/>
-            <w:tcW w:w="5670" w:type="dxa"/>
+            <w:tcW w:w="5712" w:type="dxa"/>
             <w:gridSpan w:val="3"/>
             <w:shd w:val="clear" w:color="auto" w:fill="FFFFFF" w:themeFill="background1"/>
             <w:tcMar/>
@@ -5993,7 +6083,7 @@
         <w:tc>
           <w:tcPr>
             <w:cnfStyle w:val="001000000000" w:firstRow="0" w:lastRow="0" w:firstColumn="1" w:lastColumn="0" w:oddVBand="0" w:evenVBand="0" w:oddHBand="0" w:evenHBand="0" w:firstRowFirstColumn="0" w:firstRowLastColumn="0" w:lastRowFirstColumn="0" w:lastRowLastColumn="0"/>
-            <w:tcW w:w="2535" w:type="dxa"/>
+            <w:tcW w:w="2428" w:type="dxa"/>
             <w:gridSpan w:val="2"/>
             <w:tcMar/>
           </w:tcPr>
@@ -6017,26 +6107,33 @@
         <w:tc>
           <w:tcPr>
             <w:cnfStyle w:val="000000000000" w:firstRow="0" w:lastRow="0" w:firstColumn="0" w:lastColumn="0" w:oddVBand="0" w:evenVBand="0" w:oddHBand="0" w:evenHBand="0" w:firstRowFirstColumn="0" w:firstRowLastColumn="0" w:lastRowFirstColumn="0" w:lastRowLastColumn="0"/>
-            <w:tcW w:w="7470" w:type="dxa"/>
+            <w:tcW w:w="7577" w:type="dxa"/>
             <w:gridSpan w:val="4"/>
             <w:shd w:val="clear" w:color="auto" w:fill="FFFFFF" w:themeFill="background1"/>
             <w:tcMar/>
           </w:tcPr>
           <w:p>
             <w:pPr>
-              <w:cnfStyle w:val="000000000000" w:firstRow="0" w:lastRow="0" w:firstColumn="0" w:lastColumn="0" w:oddVBand="0" w:evenVBand="0" w:oddHBand="0" w:evenHBand="0" w:firstRowFirstColumn="0" w:firstRowLastColumn="0" w:lastRowFirstColumn="0" w:lastRowLastColumn="0"/>
-              <w:rPr>
-                <w:rFonts w:ascii="Calibri" w:hAnsi="Calibri" w:eastAsia="Calibri" w:cs="Calibri"/>
-                <w:color w:val="000000"/>
-              </w:rPr>
-            </w:pPr>
-            <w:r>
-              <w:rPr>
-                <w:rFonts w:ascii="Calibri" w:hAnsi="Calibri" w:eastAsia="Calibri" w:cs="Calibri"/>
-                <w:color w:val="000000"/>
-              </w:rPr>
-              <w:t>¡Excelente! Te felicito, has seleccionado la respuesta correcta</w:t>
-            </w:r>
+              <w:rPr>
+                <w:rFonts w:ascii="Calibri" w:hAnsi="Calibri" w:eastAsia="Calibri" w:cs="Calibri"/>
+                <w:color w:val="000000" w:themeColor="text1" w:themeTint="FF" w:themeShade="FF"/>
+              </w:rPr>
+            </w:pPr>
+            <w:r>
+              <w:rPr>
+                <w:rFonts w:ascii="Calibri" w:hAnsi="Calibri" w:eastAsia="Calibri" w:cs="Calibri"/>
+                <w:color w:val="000000" w:themeColor="text1" w:themeTint="FF" w:themeShade="FF"/>
+              </w:rPr>
+              <w:t>¡Excelente felicidades!, ha seleccionado la respuesta correcta</w:t>
+            </w:r>
+          </w:p>
+          <w:p>
+            <w:pPr>
+              <w:rPr>
+                <w:rFonts w:ascii="Calibri" w:hAnsi="Calibri" w:eastAsia="Calibri" w:cs="Calibri"/>
+                <w:color w:val="000000" w:themeColor="text1" w:themeTint="FF" w:themeShade="FF"/>
+              </w:rPr>
+            </w:pPr>
           </w:p>
           <w:p>
             <w:pPr>
@@ -6058,7 +6155,7 @@
         <w:tc>
           <w:tcPr>
             <w:cnfStyle w:val="001000000000" w:firstRow="0" w:lastRow="0" w:firstColumn="1" w:lastColumn="0" w:oddVBand="0" w:evenVBand="0" w:oddHBand="0" w:evenHBand="0" w:firstRowFirstColumn="0" w:firstRowLastColumn="0" w:lastRowFirstColumn="0" w:lastRowLastColumn="0"/>
-            <w:tcW w:w="2535" w:type="dxa"/>
+            <w:tcW w:w="2428" w:type="dxa"/>
             <w:gridSpan w:val="2"/>
             <w:tcMar/>
           </w:tcPr>
@@ -6090,26 +6187,33 @@
         <w:tc>
           <w:tcPr>
             <w:cnfStyle w:val="000000000000" w:firstRow="0" w:lastRow="0" w:firstColumn="0" w:lastColumn="0" w:oddVBand="0" w:evenVBand="0" w:oddHBand="0" w:evenHBand="0" w:firstRowFirstColumn="0" w:firstRowLastColumn="0" w:lastRowFirstColumn="0" w:lastRowLastColumn="0"/>
-            <w:tcW w:w="7470" w:type="dxa"/>
+            <w:tcW w:w="7577" w:type="dxa"/>
             <w:gridSpan w:val="4"/>
             <w:shd w:val="clear" w:color="auto" w:fill="FFFFFF" w:themeFill="background1"/>
             <w:tcMar/>
           </w:tcPr>
           <w:p>
             <w:pPr>
-              <w:cnfStyle w:val="000000100000" w:firstRow="0" w:lastRow="0" w:firstColumn="0" w:lastColumn="0" w:oddVBand="0" w:evenVBand="0" w:oddHBand="1" w:evenHBand="0" w:firstRowFirstColumn="0" w:firstRowLastColumn="0" w:lastRowFirstColumn="0" w:lastRowLastColumn="0"/>
-              <w:rPr>
-                <w:rFonts w:ascii="Calibri" w:hAnsi="Calibri" w:eastAsia="Calibri" w:cs="Calibri"/>
-                <w:color w:val="000000"/>
-              </w:rPr>
-            </w:pPr>
-            <w:r>
-              <w:rPr>
-                <w:rFonts w:ascii="Calibri" w:hAnsi="Calibri" w:eastAsia="Calibri" w:cs="Calibri"/>
-                <w:color w:val="000000"/>
-              </w:rPr>
-              <w:t>Te recomendamos volver a revisar el componente formativo e intentar nuevamente la actividad didáctica</w:t>
-            </w:r>
+              <w:rPr>
+                <w:rFonts w:ascii="Calibri" w:hAnsi="Calibri" w:eastAsia="Calibri" w:cs="Calibri"/>
+                <w:color w:val="000000" w:themeColor="text1" w:themeTint="FF" w:themeShade="FF"/>
+              </w:rPr>
+            </w:pPr>
+            <w:r>
+              <w:rPr>
+                <w:rFonts w:ascii="Calibri" w:hAnsi="Calibri" w:eastAsia="Calibri" w:cs="Calibri"/>
+                <w:color w:val="000000" w:themeColor="text1" w:themeTint="FF" w:themeShade="FF"/>
+              </w:rPr>
+              <w:t>Se recomienda volver a revisar el componente formativo e intentar nuevamente la actividad didáctica</w:t>
+            </w:r>
+          </w:p>
+          <w:p>
+            <w:pPr>
+              <w:rPr>
+                <w:rFonts w:ascii="Calibri" w:hAnsi="Calibri" w:eastAsia="Calibri" w:cs="Calibri"/>
+                <w:color w:val="000000" w:themeColor="text1" w:themeTint="FF" w:themeShade="FF"/>
+              </w:rPr>
+            </w:pPr>
           </w:p>
           <w:p>
             <w:pPr>
@@ -6221,7 +6325,7 @@
         <w:tc>
           <w:tcPr>
             <w:cnfStyle w:val="001000000000" w:firstRow="0" w:lastRow="0" w:firstColumn="1" w:lastColumn="0" w:oddVBand="0" w:evenVBand="0" w:oddHBand="0" w:evenHBand="0" w:firstRowFirstColumn="0" w:firstRowLastColumn="0" w:lastRowFirstColumn="0" w:lastRowLastColumn="0"/>
-            <w:tcW w:w="1125" w:type="dxa"/>
+            <w:tcW w:w="1083" w:type="dxa"/>
             <w:tcMar/>
           </w:tcPr>
           <w:p>
@@ -6244,7 +6348,7 @@
         <w:tc>
           <w:tcPr>
             <w:cnfStyle w:val="000000000000" w:firstRow="0" w:lastRow="0" w:firstColumn="0" w:lastColumn="0" w:oddVBand="0" w:evenVBand="0" w:oddHBand="0" w:evenHBand="0" w:firstRowFirstColumn="0" w:firstRowLastColumn="0" w:lastRowFirstColumn="0" w:lastRowLastColumn="0"/>
-            <w:tcW w:w="5670" w:type="dxa"/>
+            <w:tcW w:w="5712" w:type="dxa"/>
             <w:gridSpan w:val="3"/>
             <w:tcMar/>
           </w:tcPr>
@@ -6347,7 +6451,7 @@
         <w:tc>
           <w:tcPr>
             <w:cnfStyle w:val="001000000000" w:firstRow="0" w:lastRow="0" w:firstColumn="1" w:lastColumn="0" w:oddVBand="0" w:evenVBand="0" w:oddHBand="0" w:evenHBand="0" w:firstRowFirstColumn="0" w:firstRowLastColumn="0" w:lastRowFirstColumn="0" w:lastRowLastColumn="0"/>
-            <w:tcW w:w="1125" w:type="dxa"/>
+            <w:tcW w:w="1083" w:type="dxa"/>
             <w:tcMar/>
           </w:tcPr>
           <w:p>
@@ -6370,7 +6474,7 @@
         <w:tc>
           <w:tcPr>
             <w:cnfStyle w:val="000000000000" w:firstRow="0" w:lastRow="0" w:firstColumn="0" w:lastColumn="0" w:oddVBand="0" w:evenVBand="0" w:oddHBand="0" w:evenHBand="0" w:firstRowFirstColumn="0" w:firstRowLastColumn="0" w:lastRowFirstColumn="0" w:lastRowLastColumn="0"/>
-            <w:tcW w:w="5670" w:type="dxa"/>
+            <w:tcW w:w="5712" w:type="dxa"/>
             <w:gridSpan w:val="3"/>
             <w:shd w:val="clear" w:color="auto" w:fill="FFFFFF" w:themeFill="background1"/>
             <w:tcMar/>
@@ -6440,7 +6544,7 @@
         <w:tc>
           <w:tcPr>
             <w:cnfStyle w:val="001000000000" w:firstRow="0" w:lastRow="0" w:firstColumn="1" w:lastColumn="0" w:oddVBand="0" w:evenVBand="0" w:oddHBand="0" w:evenHBand="0" w:firstRowFirstColumn="0" w:firstRowLastColumn="0" w:lastRowFirstColumn="0" w:lastRowLastColumn="0"/>
-            <w:tcW w:w="1125" w:type="dxa"/>
+            <w:tcW w:w="1083" w:type="dxa"/>
             <w:tcMar/>
           </w:tcPr>
           <w:p>
@@ -6463,7 +6567,7 @@
         <w:tc>
           <w:tcPr>
             <w:cnfStyle w:val="000000000000" w:firstRow="0" w:lastRow="0" w:firstColumn="0" w:lastColumn="0" w:oddVBand="0" w:evenVBand="0" w:oddHBand="0" w:evenHBand="0" w:firstRowFirstColumn="0" w:firstRowLastColumn="0" w:lastRowFirstColumn="0" w:lastRowLastColumn="0"/>
-            <w:tcW w:w="5670" w:type="dxa"/>
+            <w:tcW w:w="5712" w:type="dxa"/>
             <w:gridSpan w:val="3"/>
             <w:shd w:val="clear" w:color="auto" w:fill="FFFFFF" w:themeFill="background1"/>
             <w:tcMar/>
@@ -6534,7 +6638,7 @@
         <w:tc>
           <w:tcPr>
             <w:cnfStyle w:val="001000000000" w:firstRow="0" w:lastRow="0" w:firstColumn="1" w:lastColumn="0" w:oddVBand="0" w:evenVBand="0" w:oddHBand="0" w:evenHBand="0" w:firstRowFirstColumn="0" w:firstRowLastColumn="0" w:lastRowFirstColumn="0" w:lastRowLastColumn="0"/>
-            <w:tcW w:w="1125" w:type="dxa"/>
+            <w:tcW w:w="1083" w:type="dxa"/>
             <w:tcMar/>
           </w:tcPr>
           <w:p>
@@ -6557,7 +6661,7 @@
         <w:tc>
           <w:tcPr>
             <w:cnfStyle w:val="000000000000" w:firstRow="0" w:lastRow="0" w:firstColumn="0" w:lastColumn="0" w:oddVBand="0" w:evenVBand="0" w:oddHBand="0" w:evenHBand="0" w:firstRowFirstColumn="0" w:firstRowLastColumn="0" w:lastRowFirstColumn="0" w:lastRowLastColumn="0"/>
-            <w:tcW w:w="5670" w:type="dxa"/>
+            <w:tcW w:w="5712" w:type="dxa"/>
             <w:gridSpan w:val="3"/>
             <w:shd w:val="clear" w:color="auto" w:fill="FFFFFF" w:themeFill="background1"/>
             <w:tcMar/>
@@ -6643,7 +6747,7 @@
         <w:tc>
           <w:tcPr>
             <w:cnfStyle w:val="001000000000" w:firstRow="0" w:lastRow="0" w:firstColumn="1" w:lastColumn="0" w:oddVBand="0" w:evenVBand="0" w:oddHBand="0" w:evenHBand="0" w:firstRowFirstColumn="0" w:firstRowLastColumn="0" w:lastRowFirstColumn="0" w:lastRowLastColumn="0"/>
-            <w:tcW w:w="1125" w:type="dxa"/>
+            <w:tcW w:w="1083" w:type="dxa"/>
             <w:tcMar/>
           </w:tcPr>
           <w:p>
@@ -6666,7 +6770,7 @@
         <w:tc>
           <w:tcPr>
             <w:cnfStyle w:val="000000000000" w:firstRow="0" w:lastRow="0" w:firstColumn="0" w:lastColumn="0" w:oddVBand="0" w:evenVBand="0" w:oddHBand="0" w:evenHBand="0" w:firstRowFirstColumn="0" w:firstRowLastColumn="0" w:lastRowFirstColumn="0" w:lastRowLastColumn="0"/>
-            <w:tcW w:w="5670" w:type="dxa"/>
+            <w:tcW w:w="5712" w:type="dxa"/>
             <w:gridSpan w:val="3"/>
             <w:shd w:val="clear" w:color="auto" w:fill="FFFFFF" w:themeFill="background1"/>
             <w:tcMar/>
@@ -6767,7 +6871,7 @@
         <w:tc>
           <w:tcPr>
             <w:cnfStyle w:val="001000000000" w:firstRow="0" w:lastRow="0" w:firstColumn="1" w:lastColumn="0" w:oddVBand="0" w:evenVBand="0" w:oddHBand="0" w:evenHBand="0" w:firstRowFirstColumn="0" w:firstRowLastColumn="0" w:lastRowFirstColumn="0" w:lastRowLastColumn="0"/>
-            <w:tcW w:w="2535" w:type="dxa"/>
+            <w:tcW w:w="2428" w:type="dxa"/>
             <w:gridSpan w:val="2"/>
             <w:tcMar/>
           </w:tcPr>
@@ -6791,26 +6895,33 @@
         <w:tc>
           <w:tcPr>
             <w:cnfStyle w:val="000000000000" w:firstRow="0" w:lastRow="0" w:firstColumn="0" w:lastColumn="0" w:oddVBand="0" w:evenVBand="0" w:oddHBand="0" w:evenHBand="0" w:firstRowFirstColumn="0" w:firstRowLastColumn="0" w:lastRowFirstColumn="0" w:lastRowLastColumn="0"/>
-            <w:tcW w:w="7470" w:type="dxa"/>
+            <w:tcW w:w="7577" w:type="dxa"/>
             <w:gridSpan w:val="4"/>
             <w:shd w:val="clear" w:color="auto" w:fill="FFFFFF" w:themeFill="background1"/>
             <w:tcMar/>
           </w:tcPr>
           <w:p>
             <w:pPr>
-              <w:cnfStyle w:val="000000000000" w:firstRow="0" w:lastRow="0" w:firstColumn="0" w:lastColumn="0" w:oddVBand="0" w:evenVBand="0" w:oddHBand="0" w:evenHBand="0" w:firstRowFirstColumn="0" w:firstRowLastColumn="0" w:lastRowFirstColumn="0" w:lastRowLastColumn="0"/>
-              <w:rPr>
-                <w:rFonts w:ascii="Calibri" w:hAnsi="Calibri" w:eastAsia="Calibri" w:cs="Calibri"/>
-                <w:color w:val="000000"/>
-              </w:rPr>
-            </w:pPr>
-            <w:r>
-              <w:rPr>
-                <w:rFonts w:ascii="Calibri" w:hAnsi="Calibri" w:eastAsia="Calibri" w:cs="Calibri"/>
-                <w:color w:val="000000"/>
-              </w:rPr>
-              <w:t>¡Excelente! Te felicito, has seleccionado la respuesta correcta</w:t>
-            </w:r>
+              <w:rPr>
+                <w:rFonts w:ascii="Calibri" w:hAnsi="Calibri" w:eastAsia="Calibri" w:cs="Calibri"/>
+                <w:color w:val="000000" w:themeColor="text1" w:themeTint="FF" w:themeShade="FF"/>
+              </w:rPr>
+            </w:pPr>
+            <w:r>
+              <w:rPr>
+                <w:rFonts w:ascii="Calibri" w:hAnsi="Calibri" w:eastAsia="Calibri" w:cs="Calibri"/>
+                <w:color w:val="000000" w:themeColor="text1" w:themeTint="FF" w:themeShade="FF"/>
+              </w:rPr>
+              <w:t>¡Excelente felicidades!, ha seleccionado la respuesta correcta</w:t>
+            </w:r>
+          </w:p>
+          <w:p>
+            <w:pPr>
+              <w:rPr>
+                <w:rFonts w:ascii="Calibri" w:hAnsi="Calibri" w:eastAsia="Calibri" w:cs="Calibri"/>
+                <w:color w:val="000000" w:themeColor="text1" w:themeTint="FF" w:themeShade="FF"/>
+              </w:rPr>
+            </w:pPr>
           </w:p>
           <w:p>
             <w:pPr>
@@ -6832,7 +6943,7 @@
         <w:tc>
           <w:tcPr>
             <w:cnfStyle w:val="001000000000" w:firstRow="0" w:lastRow="0" w:firstColumn="1" w:lastColumn="0" w:oddVBand="0" w:evenVBand="0" w:oddHBand="0" w:evenHBand="0" w:firstRowFirstColumn="0" w:firstRowLastColumn="0" w:lastRowFirstColumn="0" w:lastRowLastColumn="0"/>
-            <w:tcW w:w="2535" w:type="dxa"/>
+            <w:tcW w:w="2428" w:type="dxa"/>
             <w:gridSpan w:val="2"/>
             <w:tcMar/>
           </w:tcPr>
@@ -6864,26 +6975,33 @@
         <w:tc>
           <w:tcPr>
             <w:cnfStyle w:val="000000000000" w:firstRow="0" w:lastRow="0" w:firstColumn="0" w:lastColumn="0" w:oddVBand="0" w:evenVBand="0" w:oddHBand="0" w:evenHBand="0" w:firstRowFirstColumn="0" w:firstRowLastColumn="0" w:lastRowFirstColumn="0" w:lastRowLastColumn="0"/>
-            <w:tcW w:w="7470" w:type="dxa"/>
+            <w:tcW w:w="7577" w:type="dxa"/>
             <w:gridSpan w:val="4"/>
             <w:shd w:val="clear" w:color="auto" w:fill="FFFFFF" w:themeFill="background1"/>
             <w:tcMar/>
           </w:tcPr>
           <w:p>
             <w:pPr>
-              <w:cnfStyle w:val="000000100000" w:firstRow="0" w:lastRow="0" w:firstColumn="0" w:lastColumn="0" w:oddVBand="0" w:evenVBand="0" w:oddHBand="1" w:evenHBand="0" w:firstRowFirstColumn="0" w:firstRowLastColumn="0" w:lastRowFirstColumn="0" w:lastRowLastColumn="0"/>
-              <w:rPr>
-                <w:rFonts w:ascii="Calibri" w:hAnsi="Calibri" w:eastAsia="Calibri" w:cs="Calibri"/>
-                <w:color w:val="000000"/>
-              </w:rPr>
-            </w:pPr>
-            <w:r>
-              <w:rPr>
-                <w:rFonts w:ascii="Calibri" w:hAnsi="Calibri" w:eastAsia="Calibri" w:cs="Calibri"/>
-                <w:color w:val="000000"/>
-              </w:rPr>
-              <w:t>Te recomendamos volver a revisar el componente formativo e intentar nuevamente la actividad didáctica</w:t>
-            </w:r>
+              <w:rPr>
+                <w:rFonts w:ascii="Calibri" w:hAnsi="Calibri" w:eastAsia="Calibri" w:cs="Calibri"/>
+                <w:color w:val="000000" w:themeColor="text1" w:themeTint="FF" w:themeShade="FF"/>
+              </w:rPr>
+            </w:pPr>
+            <w:r>
+              <w:rPr>
+                <w:rFonts w:ascii="Calibri" w:hAnsi="Calibri" w:eastAsia="Calibri" w:cs="Calibri"/>
+                <w:color w:val="000000" w:themeColor="text1" w:themeTint="FF" w:themeShade="FF"/>
+              </w:rPr>
+              <w:t>Se recomienda volver a revisar el componente formativo e intentar nuevamente la actividad didáctica</w:t>
+            </w:r>
+          </w:p>
+          <w:p>
+            <w:pPr>
+              <w:rPr>
+                <w:rFonts w:ascii="Calibri" w:hAnsi="Calibri" w:eastAsia="Calibri" w:cs="Calibri"/>
+                <w:color w:val="000000" w:themeColor="text1" w:themeTint="FF" w:themeShade="FF"/>
+              </w:rPr>
+            </w:pPr>
           </w:p>
           <w:p>
             <w:pPr>
@@ -6995,7 +7113,7 @@
         <w:tc>
           <w:tcPr>
             <w:cnfStyle w:val="001000000000" w:firstRow="0" w:lastRow="0" w:firstColumn="1" w:lastColumn="0" w:oddVBand="0" w:evenVBand="0" w:oddHBand="0" w:evenHBand="0" w:firstRowFirstColumn="0" w:firstRowLastColumn="0" w:lastRowFirstColumn="0" w:lastRowLastColumn="0"/>
-            <w:tcW w:w="1125" w:type="dxa"/>
+            <w:tcW w:w="1083" w:type="dxa"/>
             <w:tcMar/>
           </w:tcPr>
           <w:p>
@@ -7018,7 +7136,7 @@
         <w:tc>
           <w:tcPr>
             <w:cnfStyle w:val="000000000000" w:firstRow="0" w:lastRow="0" w:firstColumn="0" w:lastColumn="0" w:oddVBand="0" w:evenVBand="0" w:oddHBand="0" w:evenHBand="0" w:firstRowFirstColumn="0" w:firstRowLastColumn="0" w:lastRowFirstColumn="0" w:lastRowLastColumn="0"/>
-            <w:tcW w:w="5670" w:type="dxa"/>
+            <w:tcW w:w="5712" w:type="dxa"/>
             <w:gridSpan w:val="3"/>
             <w:tcMar/>
           </w:tcPr>
@@ -7121,7 +7239,7 @@
         <w:tc>
           <w:tcPr>
             <w:cnfStyle w:val="001000000000" w:firstRow="0" w:lastRow="0" w:firstColumn="1" w:lastColumn="0" w:oddVBand="0" w:evenVBand="0" w:oddHBand="0" w:evenHBand="0" w:firstRowFirstColumn="0" w:firstRowLastColumn="0" w:lastRowFirstColumn="0" w:lastRowLastColumn="0"/>
-            <w:tcW w:w="1125" w:type="dxa"/>
+            <w:tcW w:w="1083" w:type="dxa"/>
             <w:tcMar/>
           </w:tcPr>
           <w:p>
@@ -7144,7 +7262,7 @@
         <w:tc>
           <w:tcPr>
             <w:cnfStyle w:val="000000000000" w:firstRow="0" w:lastRow="0" w:firstColumn="0" w:lastColumn="0" w:oddVBand="0" w:evenVBand="0" w:oddHBand="0" w:evenHBand="0" w:firstRowFirstColumn="0" w:firstRowLastColumn="0" w:lastRowFirstColumn="0" w:lastRowLastColumn="0"/>
-            <w:tcW w:w="5670" w:type="dxa"/>
+            <w:tcW w:w="5712" w:type="dxa"/>
             <w:gridSpan w:val="3"/>
             <w:shd w:val="clear" w:color="auto" w:fill="FFFFFF" w:themeFill="background1"/>
             <w:tcMar/>
@@ -7214,7 +7332,7 @@
         <w:tc>
           <w:tcPr>
             <w:cnfStyle w:val="001000000000" w:firstRow="0" w:lastRow="0" w:firstColumn="1" w:lastColumn="0" w:oddVBand="0" w:evenVBand="0" w:oddHBand="0" w:evenHBand="0" w:firstRowFirstColumn="0" w:firstRowLastColumn="0" w:lastRowFirstColumn="0" w:lastRowLastColumn="0"/>
-            <w:tcW w:w="1125" w:type="dxa"/>
+            <w:tcW w:w="1083" w:type="dxa"/>
             <w:tcMar/>
           </w:tcPr>
           <w:p>
@@ -7237,7 +7355,7 @@
         <w:tc>
           <w:tcPr>
             <w:cnfStyle w:val="000000000000" w:firstRow="0" w:lastRow="0" w:firstColumn="0" w:lastColumn="0" w:oddVBand="0" w:evenVBand="0" w:oddHBand="0" w:evenHBand="0" w:firstRowFirstColumn="0" w:firstRowLastColumn="0" w:lastRowFirstColumn="0" w:lastRowLastColumn="0"/>
-            <w:tcW w:w="5670" w:type="dxa"/>
+            <w:tcW w:w="5712" w:type="dxa"/>
             <w:gridSpan w:val="3"/>
             <w:shd w:val="clear" w:color="auto" w:fill="FFFFFF" w:themeFill="background1"/>
             <w:tcMar/>
@@ -7308,7 +7426,7 @@
         <w:tc>
           <w:tcPr>
             <w:cnfStyle w:val="001000000000" w:firstRow="0" w:lastRow="0" w:firstColumn="1" w:lastColumn="0" w:oddVBand="0" w:evenVBand="0" w:oddHBand="0" w:evenHBand="0" w:firstRowFirstColumn="0" w:firstRowLastColumn="0" w:lastRowFirstColumn="0" w:lastRowLastColumn="0"/>
-            <w:tcW w:w="1125" w:type="dxa"/>
+            <w:tcW w:w="1083" w:type="dxa"/>
             <w:tcMar/>
           </w:tcPr>
           <w:p>
@@ -7331,7 +7449,7 @@
         <w:tc>
           <w:tcPr>
             <w:cnfStyle w:val="000000000000" w:firstRow="0" w:lastRow="0" w:firstColumn="0" w:lastColumn="0" w:oddVBand="0" w:evenVBand="0" w:oddHBand="0" w:evenHBand="0" w:firstRowFirstColumn="0" w:firstRowLastColumn="0" w:lastRowFirstColumn="0" w:lastRowLastColumn="0"/>
-            <w:tcW w:w="5670" w:type="dxa"/>
+            <w:tcW w:w="5712" w:type="dxa"/>
             <w:gridSpan w:val="3"/>
             <w:shd w:val="clear" w:color="auto" w:fill="FFFFFF" w:themeFill="background1"/>
             <w:tcMar/>
@@ -7417,7 +7535,7 @@
         <w:tc>
           <w:tcPr>
             <w:cnfStyle w:val="001000000000" w:firstRow="0" w:lastRow="0" w:firstColumn="1" w:lastColumn="0" w:oddVBand="0" w:evenVBand="0" w:oddHBand="0" w:evenHBand="0" w:firstRowFirstColumn="0" w:firstRowLastColumn="0" w:lastRowFirstColumn="0" w:lastRowLastColumn="0"/>
-            <w:tcW w:w="1125" w:type="dxa"/>
+            <w:tcW w:w="1083" w:type="dxa"/>
             <w:tcMar/>
           </w:tcPr>
           <w:p>
@@ -7440,7 +7558,7 @@
         <w:tc>
           <w:tcPr>
             <w:cnfStyle w:val="000000000000" w:firstRow="0" w:lastRow="0" w:firstColumn="0" w:lastColumn="0" w:oddVBand="0" w:evenVBand="0" w:oddHBand="0" w:evenHBand="0" w:firstRowFirstColumn="0" w:firstRowLastColumn="0" w:lastRowFirstColumn="0" w:lastRowLastColumn="0"/>
-            <w:tcW w:w="5670" w:type="dxa"/>
+            <w:tcW w:w="5712" w:type="dxa"/>
             <w:gridSpan w:val="3"/>
             <w:shd w:val="clear" w:color="auto" w:fill="FFFFFF" w:themeFill="background1"/>
             <w:tcMar/>
@@ -7541,7 +7659,7 @@
         <w:tc>
           <w:tcPr>
             <w:cnfStyle w:val="001000000000" w:firstRow="0" w:lastRow="0" w:firstColumn="1" w:lastColumn="0" w:oddVBand="0" w:evenVBand="0" w:oddHBand="0" w:evenHBand="0" w:firstRowFirstColumn="0" w:firstRowLastColumn="0" w:lastRowFirstColumn="0" w:lastRowLastColumn="0"/>
-            <w:tcW w:w="2535" w:type="dxa"/>
+            <w:tcW w:w="2428" w:type="dxa"/>
             <w:gridSpan w:val="2"/>
             <w:tcMar/>
           </w:tcPr>
@@ -7565,26 +7683,33 @@
         <w:tc>
           <w:tcPr>
             <w:cnfStyle w:val="000000000000" w:firstRow="0" w:lastRow="0" w:firstColumn="0" w:lastColumn="0" w:oddVBand="0" w:evenVBand="0" w:oddHBand="0" w:evenHBand="0" w:firstRowFirstColumn="0" w:firstRowLastColumn="0" w:lastRowFirstColumn="0" w:lastRowLastColumn="0"/>
-            <w:tcW w:w="7470" w:type="dxa"/>
+            <w:tcW w:w="7577" w:type="dxa"/>
             <w:gridSpan w:val="4"/>
             <w:shd w:val="clear" w:color="auto" w:fill="FFFFFF" w:themeFill="background1"/>
             <w:tcMar/>
           </w:tcPr>
           <w:p>
             <w:pPr>
-              <w:cnfStyle w:val="000000000000" w:firstRow="0" w:lastRow="0" w:firstColumn="0" w:lastColumn="0" w:oddVBand="0" w:evenVBand="0" w:oddHBand="0" w:evenHBand="0" w:firstRowFirstColumn="0" w:firstRowLastColumn="0" w:lastRowFirstColumn="0" w:lastRowLastColumn="0"/>
-              <w:rPr>
-                <w:rFonts w:ascii="Calibri" w:hAnsi="Calibri" w:eastAsia="Calibri" w:cs="Calibri"/>
-                <w:color w:val="000000"/>
-              </w:rPr>
-            </w:pPr>
-            <w:r>
-              <w:rPr>
-                <w:rFonts w:ascii="Calibri" w:hAnsi="Calibri" w:eastAsia="Calibri" w:cs="Calibri"/>
-                <w:color w:val="000000"/>
-              </w:rPr>
-              <w:t>¡Excelente! Te felicito, has seleccionado la respuesta correcta</w:t>
-            </w:r>
+              <w:rPr>
+                <w:rFonts w:ascii="Calibri" w:hAnsi="Calibri" w:eastAsia="Calibri" w:cs="Calibri"/>
+                <w:color w:val="000000" w:themeColor="text1" w:themeTint="FF" w:themeShade="FF"/>
+              </w:rPr>
+            </w:pPr>
+            <w:r>
+              <w:rPr>
+                <w:rFonts w:ascii="Calibri" w:hAnsi="Calibri" w:eastAsia="Calibri" w:cs="Calibri"/>
+                <w:color w:val="000000" w:themeColor="text1" w:themeTint="FF" w:themeShade="FF"/>
+              </w:rPr>
+              <w:t>¡Excelente felicidades!, ha seleccionado la respuesta correcta</w:t>
+            </w:r>
+          </w:p>
+          <w:p>
+            <w:pPr>
+              <w:rPr>
+                <w:rFonts w:ascii="Calibri" w:hAnsi="Calibri" w:eastAsia="Calibri" w:cs="Calibri"/>
+                <w:color w:val="000000" w:themeColor="text1" w:themeTint="FF" w:themeShade="FF"/>
+              </w:rPr>
+            </w:pPr>
           </w:p>
           <w:p>
             <w:pPr>
@@ -7606,7 +7731,7 @@
         <w:tc>
           <w:tcPr>
             <w:cnfStyle w:val="001000000000" w:firstRow="0" w:lastRow="0" w:firstColumn="1" w:lastColumn="0" w:oddVBand="0" w:evenVBand="0" w:oddHBand="0" w:evenHBand="0" w:firstRowFirstColumn="0" w:firstRowLastColumn="0" w:lastRowFirstColumn="0" w:lastRowLastColumn="0"/>
-            <w:tcW w:w="2535" w:type="dxa"/>
+            <w:tcW w:w="2428" w:type="dxa"/>
             <w:gridSpan w:val="2"/>
             <w:tcMar/>
           </w:tcPr>
@@ -7638,26 +7763,33 @@
         <w:tc>
           <w:tcPr>
             <w:cnfStyle w:val="000000000000" w:firstRow="0" w:lastRow="0" w:firstColumn="0" w:lastColumn="0" w:oddVBand="0" w:evenVBand="0" w:oddHBand="0" w:evenHBand="0" w:firstRowFirstColumn="0" w:firstRowLastColumn="0" w:lastRowFirstColumn="0" w:lastRowLastColumn="0"/>
-            <w:tcW w:w="7470" w:type="dxa"/>
+            <w:tcW w:w="7577" w:type="dxa"/>
             <w:gridSpan w:val="4"/>
             <w:shd w:val="clear" w:color="auto" w:fill="FFFFFF" w:themeFill="background1"/>
             <w:tcMar/>
           </w:tcPr>
           <w:p>
             <w:pPr>
-              <w:cnfStyle w:val="000000100000" w:firstRow="0" w:lastRow="0" w:firstColumn="0" w:lastColumn="0" w:oddVBand="0" w:evenVBand="0" w:oddHBand="1" w:evenHBand="0" w:firstRowFirstColumn="0" w:firstRowLastColumn="0" w:lastRowFirstColumn="0" w:lastRowLastColumn="0"/>
-              <w:rPr>
-                <w:rFonts w:ascii="Calibri" w:hAnsi="Calibri" w:eastAsia="Calibri" w:cs="Calibri"/>
-                <w:color w:val="000000"/>
-              </w:rPr>
-            </w:pPr>
-            <w:r>
-              <w:rPr>
-                <w:rFonts w:ascii="Calibri" w:hAnsi="Calibri" w:eastAsia="Calibri" w:cs="Calibri"/>
-                <w:color w:val="000000"/>
-              </w:rPr>
-              <w:t>Te recomendamos volver a revisar el componente formativo e intentar nuevamente la actividad didáctica</w:t>
-            </w:r>
+              <w:rPr>
+                <w:rFonts w:ascii="Calibri" w:hAnsi="Calibri" w:eastAsia="Calibri" w:cs="Calibri"/>
+                <w:color w:val="000000" w:themeColor="text1" w:themeTint="FF" w:themeShade="FF"/>
+              </w:rPr>
+            </w:pPr>
+            <w:r>
+              <w:rPr>
+                <w:rFonts w:ascii="Calibri" w:hAnsi="Calibri" w:eastAsia="Calibri" w:cs="Calibri"/>
+                <w:color w:val="000000" w:themeColor="text1" w:themeTint="FF" w:themeShade="FF"/>
+              </w:rPr>
+              <w:t>Se recomienda volver a revisar el componente formativo e intentar nuevamente la actividad didáctica</w:t>
+            </w:r>
+          </w:p>
+          <w:p>
+            <w:pPr>
+              <w:rPr>
+                <w:rFonts w:ascii="Calibri" w:hAnsi="Calibri" w:eastAsia="Calibri" w:cs="Calibri"/>
+                <w:color w:val="000000" w:themeColor="text1" w:themeTint="FF" w:themeShade="FF"/>
+              </w:rPr>
+            </w:pPr>
           </w:p>
           <w:p>
             <w:pPr>
@@ -7769,7 +7901,7 @@
         <w:tc>
           <w:tcPr>
             <w:cnfStyle w:val="001000000000" w:firstRow="0" w:lastRow="0" w:firstColumn="1" w:lastColumn="0" w:oddVBand="0" w:evenVBand="0" w:oddHBand="0" w:evenHBand="0" w:firstRowFirstColumn="0" w:firstRowLastColumn="0" w:lastRowFirstColumn="0" w:lastRowLastColumn="0"/>
-            <w:tcW w:w="1125" w:type="dxa"/>
+            <w:tcW w:w="1083" w:type="dxa"/>
             <w:tcMar/>
           </w:tcPr>
           <w:p>
@@ -7792,7 +7924,7 @@
         <w:tc>
           <w:tcPr>
             <w:cnfStyle w:val="000000000000" w:firstRow="0" w:lastRow="0" w:firstColumn="0" w:lastColumn="0" w:oddVBand="0" w:evenVBand="0" w:oddHBand="0" w:evenHBand="0" w:firstRowFirstColumn="0" w:firstRowLastColumn="0" w:lastRowFirstColumn="0" w:lastRowLastColumn="0"/>
-            <w:tcW w:w="5670" w:type="dxa"/>
+            <w:tcW w:w="5712" w:type="dxa"/>
             <w:gridSpan w:val="3"/>
             <w:tcMar/>
           </w:tcPr>
@@ -7895,7 +8027,7 @@
         <w:tc>
           <w:tcPr>
             <w:cnfStyle w:val="001000000000" w:firstRow="0" w:lastRow="0" w:firstColumn="1" w:lastColumn="0" w:oddVBand="0" w:evenVBand="0" w:oddHBand="0" w:evenHBand="0" w:firstRowFirstColumn="0" w:firstRowLastColumn="0" w:lastRowFirstColumn="0" w:lastRowLastColumn="0"/>
-            <w:tcW w:w="1125" w:type="dxa"/>
+            <w:tcW w:w="1083" w:type="dxa"/>
             <w:tcMar/>
           </w:tcPr>
           <w:p>
@@ -7918,7 +8050,7 @@
         <w:tc>
           <w:tcPr>
             <w:cnfStyle w:val="000000000000" w:firstRow="0" w:lastRow="0" w:firstColumn="0" w:lastColumn="0" w:oddVBand="0" w:evenVBand="0" w:oddHBand="0" w:evenHBand="0" w:firstRowFirstColumn="0" w:firstRowLastColumn="0" w:lastRowFirstColumn="0" w:lastRowLastColumn="0"/>
-            <w:tcW w:w="5670" w:type="dxa"/>
+            <w:tcW w:w="5712" w:type="dxa"/>
             <w:gridSpan w:val="3"/>
             <w:shd w:val="clear" w:color="auto" w:fill="FFFFFF" w:themeFill="background1"/>
             <w:tcMar/>
@@ -8005,7 +8137,7 @@
         <w:tc>
           <w:tcPr>
             <w:cnfStyle w:val="001000000000" w:firstRow="0" w:lastRow="0" w:firstColumn="1" w:lastColumn="0" w:oddVBand="0" w:evenVBand="0" w:oddHBand="0" w:evenHBand="0" w:firstRowFirstColumn="0" w:firstRowLastColumn="0" w:lastRowFirstColumn="0" w:lastRowLastColumn="0"/>
-            <w:tcW w:w="1125" w:type="dxa"/>
+            <w:tcW w:w="1083" w:type="dxa"/>
             <w:tcMar/>
           </w:tcPr>
           <w:p>
@@ -8028,7 +8160,7 @@
         <w:tc>
           <w:tcPr>
             <w:cnfStyle w:val="000000000000" w:firstRow="0" w:lastRow="0" w:firstColumn="0" w:lastColumn="0" w:oddVBand="0" w:evenVBand="0" w:oddHBand="0" w:evenHBand="0" w:firstRowFirstColumn="0" w:firstRowLastColumn="0" w:lastRowFirstColumn="0" w:lastRowLastColumn="0"/>
-            <w:tcW w:w="5670" w:type="dxa"/>
+            <w:tcW w:w="5712" w:type="dxa"/>
             <w:gridSpan w:val="3"/>
             <w:shd w:val="clear" w:color="auto" w:fill="FFFFFF" w:themeFill="background1"/>
             <w:tcMar/>
@@ -8099,7 +8231,7 @@
         <w:tc>
           <w:tcPr>
             <w:cnfStyle w:val="001000000000" w:firstRow="0" w:lastRow="0" w:firstColumn="1" w:lastColumn="0" w:oddVBand="0" w:evenVBand="0" w:oddHBand="0" w:evenHBand="0" w:firstRowFirstColumn="0" w:firstRowLastColumn="0" w:lastRowFirstColumn="0" w:lastRowLastColumn="0"/>
-            <w:tcW w:w="1125" w:type="dxa"/>
+            <w:tcW w:w="1083" w:type="dxa"/>
             <w:tcMar/>
           </w:tcPr>
           <w:p>
@@ -8122,7 +8254,7 @@
         <w:tc>
           <w:tcPr>
             <w:cnfStyle w:val="000000000000" w:firstRow="0" w:lastRow="0" w:firstColumn="0" w:lastColumn="0" w:oddVBand="0" w:evenVBand="0" w:oddHBand="0" w:evenHBand="0" w:firstRowFirstColumn="0" w:firstRowLastColumn="0" w:lastRowFirstColumn="0" w:lastRowLastColumn="0"/>
-            <w:tcW w:w="5670" w:type="dxa"/>
+            <w:tcW w:w="5712" w:type="dxa"/>
             <w:gridSpan w:val="3"/>
             <w:shd w:val="clear" w:color="auto" w:fill="FFFFFF" w:themeFill="background1"/>
             <w:tcMar/>
@@ -8191,7 +8323,7 @@
         <w:tc>
           <w:tcPr>
             <w:cnfStyle w:val="001000000000" w:firstRow="0" w:lastRow="0" w:firstColumn="1" w:lastColumn="0" w:oddVBand="0" w:evenVBand="0" w:oddHBand="0" w:evenHBand="0" w:firstRowFirstColumn="0" w:firstRowLastColumn="0" w:lastRowFirstColumn="0" w:lastRowLastColumn="0"/>
-            <w:tcW w:w="1125" w:type="dxa"/>
+            <w:tcW w:w="1083" w:type="dxa"/>
             <w:tcMar/>
           </w:tcPr>
           <w:p>
@@ -8214,7 +8346,7 @@
         <w:tc>
           <w:tcPr>
             <w:cnfStyle w:val="000000000000" w:firstRow="0" w:lastRow="0" w:firstColumn="0" w:lastColumn="0" w:oddVBand="0" w:evenVBand="0" w:oddHBand="0" w:evenHBand="0" w:firstRowFirstColumn="0" w:firstRowLastColumn="0" w:lastRowFirstColumn="0" w:lastRowLastColumn="0"/>
-            <w:tcW w:w="5670" w:type="dxa"/>
+            <w:tcW w:w="5712" w:type="dxa"/>
             <w:gridSpan w:val="3"/>
             <w:shd w:val="clear" w:color="auto" w:fill="FFFFFF" w:themeFill="background1"/>
             <w:tcMar/>
@@ -8315,7 +8447,7 @@
         <w:tc>
           <w:tcPr>
             <w:cnfStyle w:val="001000000000" w:firstRow="0" w:lastRow="0" w:firstColumn="1" w:lastColumn="0" w:oddVBand="0" w:evenVBand="0" w:oddHBand="0" w:evenHBand="0" w:firstRowFirstColumn="0" w:firstRowLastColumn="0" w:lastRowFirstColumn="0" w:lastRowLastColumn="0"/>
-            <w:tcW w:w="2535" w:type="dxa"/>
+            <w:tcW w:w="2428" w:type="dxa"/>
             <w:gridSpan w:val="2"/>
             <w:tcMar/>
           </w:tcPr>
@@ -8339,26 +8471,33 @@
         <w:tc>
           <w:tcPr>
             <w:cnfStyle w:val="000000000000" w:firstRow="0" w:lastRow="0" w:firstColumn="0" w:lastColumn="0" w:oddVBand="0" w:evenVBand="0" w:oddHBand="0" w:evenHBand="0" w:firstRowFirstColumn="0" w:firstRowLastColumn="0" w:lastRowFirstColumn="0" w:lastRowLastColumn="0"/>
-            <w:tcW w:w="7470" w:type="dxa"/>
+            <w:tcW w:w="7577" w:type="dxa"/>
             <w:gridSpan w:val="4"/>
             <w:shd w:val="clear" w:color="auto" w:fill="FFFFFF" w:themeFill="background1"/>
             <w:tcMar/>
           </w:tcPr>
           <w:p>
             <w:pPr>
-              <w:cnfStyle w:val="000000000000" w:firstRow="0" w:lastRow="0" w:firstColumn="0" w:lastColumn="0" w:oddVBand="0" w:evenVBand="0" w:oddHBand="0" w:evenHBand="0" w:firstRowFirstColumn="0" w:firstRowLastColumn="0" w:lastRowFirstColumn="0" w:lastRowLastColumn="0"/>
-              <w:rPr>
-                <w:rFonts w:ascii="Calibri" w:hAnsi="Calibri" w:eastAsia="Calibri" w:cs="Calibri"/>
-                <w:color w:val="000000"/>
-              </w:rPr>
-            </w:pPr>
-            <w:r>
-              <w:rPr>
-                <w:rFonts w:ascii="Calibri" w:hAnsi="Calibri" w:eastAsia="Calibri" w:cs="Calibri"/>
-                <w:color w:val="000000"/>
-              </w:rPr>
-              <w:t>¡Excelente! Te felicito, has seleccionado la respuesta correcta</w:t>
-            </w:r>
+              <w:rPr>
+                <w:rFonts w:ascii="Calibri" w:hAnsi="Calibri" w:eastAsia="Calibri" w:cs="Calibri"/>
+                <w:color w:val="000000" w:themeColor="text1" w:themeTint="FF" w:themeShade="FF"/>
+              </w:rPr>
+            </w:pPr>
+            <w:r>
+              <w:rPr>
+                <w:rFonts w:ascii="Calibri" w:hAnsi="Calibri" w:eastAsia="Calibri" w:cs="Calibri"/>
+                <w:color w:val="000000" w:themeColor="text1" w:themeTint="FF" w:themeShade="FF"/>
+              </w:rPr>
+              <w:t>¡Excelente felicidades!, ha seleccionado la respuesta correcta</w:t>
+            </w:r>
+          </w:p>
+          <w:p>
+            <w:pPr>
+              <w:rPr>
+                <w:rFonts w:ascii="Calibri" w:hAnsi="Calibri" w:eastAsia="Calibri" w:cs="Calibri"/>
+                <w:color w:val="000000" w:themeColor="text1" w:themeTint="FF" w:themeShade="FF"/>
+              </w:rPr>
+            </w:pPr>
           </w:p>
           <w:p>
             <w:pPr>
@@ -8380,7 +8519,7 @@
         <w:tc>
           <w:tcPr>
             <w:cnfStyle w:val="001000000000" w:firstRow="0" w:lastRow="0" w:firstColumn="1" w:lastColumn="0" w:oddVBand="0" w:evenVBand="0" w:oddHBand="0" w:evenHBand="0" w:firstRowFirstColumn="0" w:firstRowLastColumn="0" w:lastRowFirstColumn="0" w:lastRowLastColumn="0"/>
-            <w:tcW w:w="2535" w:type="dxa"/>
+            <w:tcW w:w="2428" w:type="dxa"/>
             <w:gridSpan w:val="2"/>
             <w:tcMar/>
           </w:tcPr>
@@ -8412,7 +8551,7 @@
         <w:tc>
           <w:tcPr>
             <w:cnfStyle w:val="000000000000" w:firstRow="0" w:lastRow="0" w:firstColumn="0" w:lastColumn="0" w:oddVBand="0" w:evenVBand="0" w:oddHBand="0" w:evenHBand="0" w:firstRowFirstColumn="0" w:firstRowLastColumn="0" w:lastRowFirstColumn="0" w:lastRowLastColumn="0"/>
-            <w:tcW w:w="7470" w:type="dxa"/>
+            <w:tcW w:w="7577" w:type="dxa"/>
             <w:gridSpan w:val="4"/>
             <w:shd w:val="clear" w:color="auto" w:fill="FFFFFF" w:themeFill="background1"/>
             <w:tcMar/>
@@ -8428,9 +8567,30 @@
             <w:r>
               <w:rPr>
                 <w:rFonts w:ascii="Calibri" w:hAnsi="Calibri" w:eastAsia="Calibri" w:cs="Calibri"/>
-                <w:color w:val="000000"/>
-              </w:rPr>
-              <w:t>Te recomendamos volver a revisar el componente formativo e intentar nuevamente la actividad didáctica</w:t>
+                <w:color w:val="000000" w:themeColor="text1" w:themeTint="FF" w:themeShade="FF"/>
+              </w:rPr>
+              <w:t>Se</w:t>
+            </w:r>
+            <w:r>
+              <w:rPr>
+                <w:rFonts w:ascii="Calibri" w:hAnsi="Calibri" w:eastAsia="Calibri" w:cs="Calibri"/>
+                <w:color w:val="000000" w:themeColor="text1" w:themeTint="FF" w:themeShade="FF"/>
+              </w:rPr>
+              <w:t xml:space="preserve"> recom</w:t>
+            </w:r>
+            <w:r>
+              <w:rPr>
+                <w:rFonts w:ascii="Calibri" w:hAnsi="Calibri" w:eastAsia="Calibri" w:cs="Calibri"/>
+                <w:color w:val="000000" w:themeColor="text1" w:themeTint="FF" w:themeShade="FF"/>
+              </w:rPr>
+              <w:t xml:space="preserve">ienda </w:t>
+            </w:r>
+            <w:r>
+              <w:rPr>
+                <w:rFonts w:ascii="Calibri" w:hAnsi="Calibri" w:eastAsia="Calibri" w:cs="Calibri"/>
+                <w:color w:val="000000" w:themeColor="text1" w:themeTint="FF" w:themeShade="FF"/>
+              </w:rPr>
+              <w:t>volver a revisar el componente formativo e intentar nuevamente la actividad didáctica</w:t>
             </w:r>
           </w:p>
           <w:p>

</xml_diff>